<commit_message>
atualizando meus arquivos para subir para o git, iniciado projetoI4
</commit_message>
<xml_diff>
--- a/Projeto-Hamburgueria-next-js/Arquitetura-.docx
+++ b/Projeto-Hamburgueria-next-js/Arquitetura-.docx
@@ -1,6 +1,6 @@
 
 <file path=word/document.xml><?xml version="1.0" encoding="utf-8"?>
-<w:document xmlns:wpc="http://schemas.microsoft.com/office/word/2010/wordprocessingCanvas" xmlns:cx="http://schemas.microsoft.com/office/drawing/2014/chartex" xmlns:cx1="http://schemas.microsoft.com/office/drawing/2015/9/8/chartex" xmlns:cx2="http://schemas.microsoft.com/office/drawing/2015/10/21/chartex" xmlns:cx3="http://schemas.microsoft.com/office/drawing/2016/5/9/chartex" xmlns:cx4="http://schemas.microsoft.com/office/drawing/2016/5/10/chartex" xmlns:cx5="http://schemas.microsoft.com/office/drawing/2016/5/11/chartex" xmlns:cx6="http://schemas.microsoft.com/office/drawing/2016/5/12/chartex" xmlns:cx7="http://schemas.microsoft.com/office/drawing/2016/5/13/chartex" xmlns:cx8="http://schemas.microsoft.com/office/drawing/2016/5/14/chartex" xmlns:mc="http://schemas.openxmlformats.org/markup-compatibility/2006" xmlns:aink="http://schemas.microsoft.com/office/drawing/2016/ink" xmlns:am3d="http://schemas.microsoft.com/office/drawing/2017/model3d" xmlns:o="urn:schemas-microsoft-com:office:office" xmlns:oel="http://schemas.microsoft.com/office/2019/extlst" xmlns:r="http://schemas.openxmlformats.org/officeDocument/2006/relationships" xmlns:m="http://schemas.openxmlformats.org/officeDocument/2006/math" xmlns:v="urn:schemas-microsoft-com:vml" xmlns:wp14="http://schemas.microsoft.com/office/word/2010/wordprocessingDrawing" xmlns:wp="http://schemas.openxmlformats.org/drawingml/2006/wordprocessingDrawing" xmlns:w10="urn:schemas-microsoft-com:office:word" xmlns:w="http://schemas.openxmlformats.org/wordprocessingml/2006/main" xmlns:w14="http://schemas.microsoft.com/office/word/2010/wordml" xmlns:w15="http://schemas.microsoft.com/office/word/2012/wordml" xmlns:w16cex="http://schemas.microsoft.com/office/word/2018/wordml/cex" xmlns:w16cid="http://schemas.microsoft.com/office/word/2016/wordml/cid" xmlns:w16="http://schemas.microsoft.com/office/word/2018/wordml" xmlns:w16du="http://schemas.microsoft.com/office/word/2023/wordml/word16du" xmlns:w16sdtdh="http://schemas.microsoft.com/office/word/2020/wordml/sdtdatahash" xmlns:w16sdtfl="http://schemas.microsoft.com/office/word/2024/wordml/sdtformatlock" xmlns:w16se="http://schemas.microsoft.com/office/word/2015/wordml/symex" xmlns:wpg="http://schemas.microsoft.com/office/word/2010/wordprocessingGroup" xmlns:wpi="http://schemas.microsoft.com/office/word/2010/wordprocessingInk" xmlns:wne="http://schemas.microsoft.com/office/word/2006/wordml" xmlns:wps="http://schemas.microsoft.com/office/word/2010/wordprocessingShape" mc:Ignorable="w14 w15 w16se w16cid w16 w16cex w16sdtdh w16sdtfl w16du wp14">
+<w:document xmlns:wpc="http://schemas.microsoft.com/office/word/2010/wordprocessingCanvas" xmlns:cx="http://schemas.microsoft.com/office/drawing/2014/chartex" xmlns:cx1="http://schemas.microsoft.com/office/drawing/2015/9/8/chartex" xmlns:cx2="http://schemas.microsoft.com/office/drawing/2015/10/21/chartex" xmlns:cx3="http://schemas.microsoft.com/office/drawing/2016/5/9/chartex" xmlns:cx4="http://schemas.microsoft.com/office/drawing/2016/5/10/chartex" xmlns:cx5="http://schemas.microsoft.com/office/drawing/2016/5/11/chartex" xmlns:cx6="http://schemas.microsoft.com/office/drawing/2016/5/12/chartex" xmlns:cx7="http://schemas.microsoft.com/office/drawing/2016/5/13/chartex" xmlns:cx8="http://schemas.microsoft.com/office/drawing/2016/5/14/chartex" xmlns:mc="http://schemas.openxmlformats.org/markup-compatibility/2006" xmlns:aink="http://schemas.microsoft.com/office/drawing/2016/ink" xmlns:am3d="http://schemas.microsoft.com/office/drawing/2017/model3d" xmlns:o="urn:schemas-microsoft-com:office:office" xmlns:oel="http://schemas.microsoft.com/office/2019/extlst" xmlns:r="http://schemas.openxmlformats.org/officeDocument/2006/relationships" xmlns:m="http://schemas.openxmlformats.org/officeDocument/2006/math" xmlns:v="urn:schemas-microsoft-com:vml" xmlns:wp14="http://schemas.microsoft.com/office/word/2010/wordprocessingDrawing" xmlns:wp="http://schemas.openxmlformats.org/drawingml/2006/wordprocessingDrawing" xmlns:w10="urn:schemas-microsoft-com:office:word" xmlns:w="http://schemas.openxmlformats.org/wordprocessingml/2006/main" xmlns:w14="http://schemas.microsoft.com/office/word/2010/wordml" xmlns:w15="http://schemas.microsoft.com/office/word/2012/wordml" xmlns:w16cei="http://schemas.microsoft.com/office/word/2026/wordml/cei" xmlns:w16cex="http://schemas.microsoft.com/office/word/2018/wordml/cex" xmlns:w16cid="http://schemas.microsoft.com/office/word/2016/wordml/cid" xmlns:w16="http://schemas.microsoft.com/office/word/2018/wordml" xmlns:w16du="http://schemas.microsoft.com/office/word/2023/wordml/word16du" xmlns:w16sdtdh="http://schemas.microsoft.com/office/word/2020/wordml/sdtdatahash" xmlns:w16sdtfl="http://schemas.microsoft.com/office/word/2024/wordml/sdtformatlock" xmlns:w16se="http://schemas.microsoft.com/office/word/2015/wordml/symex" xmlns:wpg="http://schemas.microsoft.com/office/word/2010/wordprocessingGroup" xmlns:wpi="http://schemas.microsoft.com/office/word/2010/wordprocessingInk" xmlns:wne="http://schemas.microsoft.com/office/word/2006/wordml" xmlns:wps="http://schemas.microsoft.com/office/word/2010/wordprocessingShape" mc:Ignorable="w14 w15 w16se w16cid w16 w16cex w16sdtdh w16sdtfl w16du wp14">
   <w:body>
     <w:p>
       <w:pPr>
@@ -646,7 +646,7 @@
           <w14:ligatures w14:val="none"/>
         </w:rPr>
         <w:pict w14:anchorId="2034A6DB">
-          <v:rect id="_x0000_i1117" style="width:0;height:1.5pt" o:hralign="center" o:hrstd="t" o:hr="t" fillcolor="#a0a0a0" stroked="f"/>
+          <v:rect id="_x0000_i1025" style="width:0;height:1.5pt" o:hralign="center" o:hrstd="t" o:hr="t" fillcolor="#a0a0a0" stroked="f"/>
         </w:pict>
       </w:r>
     </w:p>
@@ -821,7 +821,7 @@
           <w14:ligatures w14:val="none"/>
         </w:rPr>
         <w:pict w14:anchorId="1EF1EE3C">
-          <v:rect id="_x0000_i1118" style="width:0;height:1.5pt" o:hralign="center" o:hrstd="t" o:hr="t" fillcolor="#a0a0a0" stroked="f"/>
+          <v:rect id="_x0000_i1026" style="width:0;height:1.5pt" o:hralign="center" o:hrstd="t" o:hr="t" fillcolor="#a0a0a0" stroked="f"/>
         </w:pict>
       </w:r>
     </w:p>
@@ -1256,7 +1256,7 @@
           <w14:ligatures w14:val="none"/>
         </w:rPr>
         <w:pict w14:anchorId="424D42FF">
-          <v:rect id="_x0000_i1119" style="width:0;height:1.5pt" o:hralign="center" o:hrstd="t" o:hr="t" fillcolor="#a0a0a0" stroked="f"/>
+          <v:rect id="_x0000_i1027" style="width:0;height:1.5pt" o:hralign="center" o:hrstd="t" o:hr="t" fillcolor="#a0a0a0" stroked="f"/>
         </w:pict>
       </w:r>
     </w:p>
@@ -1783,7 +1783,7 @@
           <w14:ligatures w14:val="none"/>
         </w:rPr>
         <w:pict w14:anchorId="29100A41">
-          <v:rect id="_x0000_i1120" style="width:0;height:1.5pt" o:hralign="center" o:hrstd="t" o:hr="t" fillcolor="#a0a0a0" stroked="f"/>
+          <v:rect id="_x0000_i1028" style="width:0;height:1.5pt" o:hralign="center" o:hrstd="t" o:hr="t" fillcolor="#a0a0a0" stroked="f"/>
         </w:pict>
       </w:r>
     </w:p>
@@ -2294,7 +2294,7 @@
           <w14:ligatures w14:val="none"/>
         </w:rPr>
         <w:pict w14:anchorId="67661C61">
-          <v:rect id="_x0000_i1121" style="width:0;height:1.5pt" o:hralign="center" o:hrstd="t" o:hr="t" fillcolor="#a0a0a0" stroked="f"/>
+          <v:rect id="_x0000_i1029" style="width:0;height:1.5pt" o:hralign="center" o:hrstd="t" o:hr="t" fillcolor="#a0a0a0" stroked="f"/>
         </w:pict>
       </w:r>
     </w:p>
@@ -2742,34 +2742,21 @@
           <w:kern w:val="0"/>
           <w:sz w:val="20"/>
           <w:szCs w:val="20"/>
-          <w:lang w:eastAsia="pt-BR"/>
-          <w14:ligatures w14:val="none"/>
-        </w:rPr>
-      </w:pPr>
-      <w:r>
-        <w:rPr>
-          <w:rFonts w:ascii="Courier New" w:eastAsia="Times New Roman" w:hAnsi="Courier New" w:cs="Courier New"/>
-          <w:kern w:val="0"/>
-          <w:sz w:val="20"/>
-          <w:szCs w:val="20"/>
-          <w:lang w:eastAsia="pt-BR"/>
-          <w14:ligatures w14:val="none"/>
-        </w:rPr>
-        <w:t xml:space="preserve">- </w:t>
-      </w:r>
-      <w:proofErr w:type="gramStart"/>
-      <w:r>
-        <w:rPr>
-          <w:rFonts w:ascii="Courier New" w:eastAsia="Times New Roman" w:hAnsi="Courier New" w:cs="Courier New"/>
-          <w:kern w:val="0"/>
-          <w:sz w:val="20"/>
-          <w:szCs w:val="20"/>
-          <w:lang w:eastAsia="pt-BR"/>
-          <w14:ligatures w14:val="none"/>
-        </w:rPr>
-        <w:t>id</w:t>
-      </w:r>
-      <w:proofErr w:type="gramEnd"/>
+          <w:lang w:val="en-US" w:eastAsia="pt-BR"/>
+          <w14:ligatures w14:val="none"/>
+        </w:rPr>
+      </w:pPr>
+      <w:r>
+        <w:rPr>
+          <w:rFonts w:ascii="Courier New" w:eastAsia="Times New Roman" w:hAnsi="Courier New" w:cs="Courier New"/>
+          <w:kern w:val="0"/>
+          <w:sz w:val="20"/>
+          <w:szCs w:val="20"/>
+          <w:lang w:val="en-US" w:eastAsia="pt-BR"/>
+          <w14:ligatures w14:val="none"/>
+        </w:rPr>
+        <w:t>- id</w:t>
+      </w:r>
     </w:p>
     <w:p>
       <w:pPr>
@@ -2797,36 +2784,21 @@
           <w:kern w:val="0"/>
           <w:sz w:val="20"/>
           <w:szCs w:val="20"/>
-          <w:lang w:eastAsia="pt-BR"/>
-          <w14:ligatures w14:val="none"/>
-        </w:rPr>
-      </w:pPr>
-      <w:r>
-        <w:rPr>
-          <w:rFonts w:ascii="Courier New" w:eastAsia="Times New Roman" w:hAnsi="Courier New" w:cs="Courier New"/>
-          <w:kern w:val="0"/>
-          <w:sz w:val="20"/>
-          <w:szCs w:val="20"/>
-          <w:lang w:eastAsia="pt-BR"/>
-          <w14:ligatures w14:val="none"/>
-        </w:rPr>
-        <w:t xml:space="preserve">- </w:t>
-      </w:r>
-      <w:proofErr w:type="spellStart"/>
-      <w:proofErr w:type="gramStart"/>
-      <w:r>
-        <w:rPr>
-          <w:rFonts w:ascii="Courier New" w:eastAsia="Times New Roman" w:hAnsi="Courier New" w:cs="Courier New"/>
-          <w:kern w:val="0"/>
-          <w:sz w:val="20"/>
-          <w:szCs w:val="20"/>
-          <w:lang w:eastAsia="pt-BR"/>
-          <w14:ligatures w14:val="none"/>
-        </w:rPr>
-        <w:t>name</w:t>
-      </w:r>
-      <w:proofErr w:type="spellEnd"/>
-      <w:proofErr w:type="gramEnd"/>
+          <w:lang w:val="en-US" w:eastAsia="pt-BR"/>
+          <w14:ligatures w14:val="none"/>
+        </w:rPr>
+      </w:pPr>
+      <w:r>
+        <w:rPr>
+          <w:rFonts w:ascii="Courier New" w:eastAsia="Times New Roman" w:hAnsi="Courier New" w:cs="Courier New"/>
+          <w:kern w:val="0"/>
+          <w:sz w:val="20"/>
+          <w:szCs w:val="20"/>
+          <w:lang w:val="en-US" w:eastAsia="pt-BR"/>
+          <w14:ligatures w14:val="none"/>
+        </w:rPr>
+        <w:t>- name</w:t>
+      </w:r>
     </w:p>
     <w:p>
       <w:pPr>
@@ -2854,36 +2826,21 @@
           <w:kern w:val="0"/>
           <w:sz w:val="20"/>
           <w:szCs w:val="20"/>
-          <w:lang w:eastAsia="pt-BR"/>
-          <w14:ligatures w14:val="none"/>
-        </w:rPr>
-      </w:pPr>
-      <w:r>
-        <w:rPr>
-          <w:rFonts w:ascii="Courier New" w:eastAsia="Times New Roman" w:hAnsi="Courier New" w:cs="Courier New"/>
-          <w:kern w:val="0"/>
-          <w:sz w:val="20"/>
-          <w:szCs w:val="20"/>
-          <w:lang w:eastAsia="pt-BR"/>
-          <w14:ligatures w14:val="none"/>
-        </w:rPr>
-        <w:t xml:space="preserve">- </w:t>
-      </w:r>
-      <w:proofErr w:type="spellStart"/>
-      <w:proofErr w:type="gramStart"/>
-      <w:r>
-        <w:rPr>
-          <w:rFonts w:ascii="Courier New" w:eastAsia="Times New Roman" w:hAnsi="Courier New" w:cs="Courier New"/>
-          <w:kern w:val="0"/>
-          <w:sz w:val="20"/>
-          <w:szCs w:val="20"/>
-          <w:lang w:eastAsia="pt-BR"/>
-          <w14:ligatures w14:val="none"/>
-        </w:rPr>
-        <w:t>description</w:t>
-      </w:r>
-      <w:proofErr w:type="spellEnd"/>
-      <w:proofErr w:type="gramEnd"/>
+          <w:lang w:val="en-US" w:eastAsia="pt-BR"/>
+          <w14:ligatures w14:val="none"/>
+        </w:rPr>
+      </w:pPr>
+      <w:r>
+        <w:rPr>
+          <w:rFonts w:ascii="Courier New" w:eastAsia="Times New Roman" w:hAnsi="Courier New" w:cs="Courier New"/>
+          <w:kern w:val="0"/>
+          <w:sz w:val="20"/>
+          <w:szCs w:val="20"/>
+          <w:lang w:val="en-US" w:eastAsia="pt-BR"/>
+          <w14:ligatures w14:val="none"/>
+        </w:rPr>
+        <w:t>- description</w:t>
+      </w:r>
     </w:p>
     <w:p>
       <w:pPr>
@@ -2911,45 +2868,32 @@
           <w:kern w:val="0"/>
           <w:sz w:val="20"/>
           <w:szCs w:val="20"/>
-          <w:lang w:eastAsia="pt-BR"/>
-          <w14:ligatures w14:val="none"/>
-        </w:rPr>
-      </w:pPr>
-      <w:r>
-        <w:rPr>
-          <w:rFonts w:ascii="Courier New" w:eastAsia="Times New Roman" w:hAnsi="Courier New" w:cs="Courier New"/>
-          <w:kern w:val="0"/>
-          <w:sz w:val="20"/>
-          <w:szCs w:val="20"/>
-          <w:lang w:eastAsia="pt-BR"/>
+          <w:lang w:val="en-US" w:eastAsia="pt-BR"/>
+          <w14:ligatures w14:val="none"/>
+        </w:rPr>
+      </w:pPr>
+      <w:r>
+        <w:rPr>
+          <w:rFonts w:ascii="Courier New" w:eastAsia="Times New Roman" w:hAnsi="Courier New" w:cs="Courier New"/>
+          <w:kern w:val="0"/>
+          <w:sz w:val="20"/>
+          <w:szCs w:val="20"/>
+          <w:lang w:val="en-US" w:eastAsia="pt-BR"/>
           <w14:ligatures w14:val="none"/>
         </w:rPr>
         <w:t xml:space="preserve">- </w:t>
       </w:r>
       <w:proofErr w:type="spellStart"/>
-      <w:proofErr w:type="gramStart"/>
-      <w:r>
-        <w:rPr>
-          <w:rFonts w:ascii="Courier New" w:eastAsia="Times New Roman" w:hAnsi="Courier New" w:cs="Courier New"/>
-          <w:kern w:val="0"/>
-          <w:sz w:val="20"/>
-          <w:szCs w:val="20"/>
-          <w:lang w:eastAsia="pt-BR"/>
-          <w14:ligatures w14:val="none"/>
-        </w:rPr>
-        <w:t>base</w:t>
-      </w:r>
-      <w:proofErr w:type="gramEnd"/>
-      <w:r>
-        <w:rPr>
-          <w:rFonts w:ascii="Courier New" w:eastAsia="Times New Roman" w:hAnsi="Courier New" w:cs="Courier New"/>
-          <w:kern w:val="0"/>
-          <w:sz w:val="20"/>
-          <w:szCs w:val="20"/>
-          <w:lang w:eastAsia="pt-BR"/>
-          <w14:ligatures w14:val="none"/>
-        </w:rPr>
-        <w:t>_price</w:t>
+      <w:r>
+        <w:rPr>
+          <w:rFonts w:ascii="Courier New" w:eastAsia="Times New Roman" w:hAnsi="Courier New" w:cs="Courier New"/>
+          <w:kern w:val="0"/>
+          <w:sz w:val="20"/>
+          <w:szCs w:val="20"/>
+          <w:lang w:val="en-US" w:eastAsia="pt-BR"/>
+          <w14:ligatures w14:val="none"/>
+        </w:rPr>
+        <w:t>base_price</w:t>
       </w:r>
       <w:proofErr w:type="spellEnd"/>
     </w:p>
@@ -2979,36 +2923,21 @@
           <w:kern w:val="0"/>
           <w:sz w:val="20"/>
           <w:szCs w:val="20"/>
-          <w:lang w:eastAsia="pt-BR"/>
-          <w14:ligatures w14:val="none"/>
-        </w:rPr>
-      </w:pPr>
-      <w:r>
-        <w:rPr>
-          <w:rFonts w:ascii="Courier New" w:eastAsia="Times New Roman" w:hAnsi="Courier New" w:cs="Courier New"/>
-          <w:kern w:val="0"/>
-          <w:sz w:val="20"/>
-          <w:szCs w:val="20"/>
-          <w:lang w:eastAsia="pt-BR"/>
-          <w14:ligatures w14:val="none"/>
-        </w:rPr>
-        <w:t xml:space="preserve">- </w:t>
-      </w:r>
-      <w:proofErr w:type="spellStart"/>
-      <w:proofErr w:type="gramStart"/>
-      <w:r>
-        <w:rPr>
-          <w:rFonts w:ascii="Courier New" w:eastAsia="Times New Roman" w:hAnsi="Courier New" w:cs="Courier New"/>
-          <w:kern w:val="0"/>
-          <w:sz w:val="20"/>
-          <w:szCs w:val="20"/>
-          <w:lang w:eastAsia="pt-BR"/>
-          <w14:ligatures w14:val="none"/>
-        </w:rPr>
-        <w:t>active</w:t>
-      </w:r>
-      <w:proofErr w:type="spellEnd"/>
-      <w:proofErr w:type="gramEnd"/>
+          <w:lang w:val="en-US" w:eastAsia="pt-BR"/>
+          <w14:ligatures w14:val="none"/>
+        </w:rPr>
+      </w:pPr>
+      <w:r>
+        <w:rPr>
+          <w:rFonts w:ascii="Courier New" w:eastAsia="Times New Roman" w:hAnsi="Courier New" w:cs="Courier New"/>
+          <w:kern w:val="0"/>
+          <w:sz w:val="20"/>
+          <w:szCs w:val="20"/>
+          <w:lang w:val="en-US" w:eastAsia="pt-BR"/>
+          <w14:ligatures w14:val="none"/>
+        </w:rPr>
+        <w:t>- active</w:t>
+      </w:r>
     </w:p>
     <w:p>
       <w:pPr>
@@ -3100,7 +3029,7 @@
           <w14:ligatures w14:val="none"/>
         </w:rPr>
         <w:pict w14:anchorId="535B9AFD">
-          <v:rect id="_x0000_i1122" style="width:0;height:1.5pt" o:hralign="center" o:hrstd="t" o:hr="t" fillcolor="#a0a0a0" stroked="f"/>
+          <v:rect id="_x0000_i1030" style="width:0;height:1.5pt" o:hralign="center" o:hrstd="t" o:hr="t" fillcolor="#a0a0a0" stroked="f"/>
         </w:pict>
       </w:r>
     </w:p>
@@ -3593,34 +3522,21 @@
           <w:kern w:val="0"/>
           <w:sz w:val="20"/>
           <w:szCs w:val="20"/>
-          <w:lang w:eastAsia="pt-BR"/>
-          <w14:ligatures w14:val="none"/>
-        </w:rPr>
-      </w:pPr>
-      <w:r>
-        <w:rPr>
-          <w:rFonts w:ascii="Courier New" w:eastAsia="Times New Roman" w:hAnsi="Courier New" w:cs="Courier New"/>
-          <w:kern w:val="0"/>
-          <w:sz w:val="20"/>
-          <w:szCs w:val="20"/>
-          <w:lang w:eastAsia="pt-BR"/>
-          <w14:ligatures w14:val="none"/>
-        </w:rPr>
-        <w:t xml:space="preserve">- </w:t>
-      </w:r>
-      <w:proofErr w:type="gramStart"/>
-      <w:r>
-        <w:rPr>
-          <w:rFonts w:ascii="Courier New" w:eastAsia="Times New Roman" w:hAnsi="Courier New" w:cs="Courier New"/>
-          <w:kern w:val="0"/>
-          <w:sz w:val="20"/>
-          <w:szCs w:val="20"/>
-          <w:lang w:eastAsia="pt-BR"/>
-          <w14:ligatures w14:val="none"/>
-        </w:rPr>
-        <w:t>id</w:t>
-      </w:r>
-      <w:proofErr w:type="gramEnd"/>
+          <w:lang w:val="en-US" w:eastAsia="pt-BR"/>
+          <w14:ligatures w14:val="none"/>
+        </w:rPr>
+      </w:pPr>
+      <w:r>
+        <w:rPr>
+          <w:rFonts w:ascii="Courier New" w:eastAsia="Times New Roman" w:hAnsi="Courier New" w:cs="Courier New"/>
+          <w:kern w:val="0"/>
+          <w:sz w:val="20"/>
+          <w:szCs w:val="20"/>
+          <w:lang w:val="en-US" w:eastAsia="pt-BR"/>
+          <w14:ligatures w14:val="none"/>
+        </w:rPr>
+        <w:t>- id</w:t>
+      </w:r>
     </w:p>
     <w:p>
       <w:pPr>
@@ -3648,45 +3564,32 @@
           <w:kern w:val="0"/>
           <w:sz w:val="20"/>
           <w:szCs w:val="20"/>
-          <w:lang w:eastAsia="pt-BR"/>
-          <w14:ligatures w14:val="none"/>
-        </w:rPr>
-      </w:pPr>
-      <w:r>
-        <w:rPr>
-          <w:rFonts w:ascii="Courier New" w:eastAsia="Times New Roman" w:hAnsi="Courier New" w:cs="Courier New"/>
-          <w:kern w:val="0"/>
-          <w:sz w:val="20"/>
-          <w:szCs w:val="20"/>
-          <w:lang w:eastAsia="pt-BR"/>
+          <w:lang w:val="en-US" w:eastAsia="pt-BR"/>
+          <w14:ligatures w14:val="none"/>
+        </w:rPr>
+      </w:pPr>
+      <w:r>
+        <w:rPr>
+          <w:rFonts w:ascii="Courier New" w:eastAsia="Times New Roman" w:hAnsi="Courier New" w:cs="Courier New"/>
+          <w:kern w:val="0"/>
+          <w:sz w:val="20"/>
+          <w:szCs w:val="20"/>
+          <w:lang w:val="en-US" w:eastAsia="pt-BR"/>
           <w14:ligatures w14:val="none"/>
         </w:rPr>
         <w:t xml:space="preserve">- </w:t>
       </w:r>
       <w:proofErr w:type="spellStart"/>
-      <w:proofErr w:type="gramStart"/>
-      <w:r>
-        <w:rPr>
-          <w:rFonts w:ascii="Courier New" w:eastAsia="Times New Roman" w:hAnsi="Courier New" w:cs="Courier New"/>
-          <w:kern w:val="0"/>
-          <w:sz w:val="20"/>
-          <w:szCs w:val="20"/>
-          <w:lang w:eastAsia="pt-BR"/>
-          <w14:ligatures w14:val="none"/>
-        </w:rPr>
-        <w:t>product</w:t>
-      </w:r>
-      <w:proofErr w:type="gramEnd"/>
-      <w:r>
-        <w:rPr>
-          <w:rFonts w:ascii="Courier New" w:eastAsia="Times New Roman" w:hAnsi="Courier New" w:cs="Courier New"/>
-          <w:kern w:val="0"/>
-          <w:sz w:val="20"/>
-          <w:szCs w:val="20"/>
-          <w:lang w:eastAsia="pt-BR"/>
-          <w14:ligatures w14:val="none"/>
-        </w:rPr>
-        <w:t>_id</w:t>
+      <w:r>
+        <w:rPr>
+          <w:rFonts w:ascii="Courier New" w:eastAsia="Times New Roman" w:hAnsi="Courier New" w:cs="Courier New"/>
+          <w:kern w:val="0"/>
+          <w:sz w:val="20"/>
+          <w:szCs w:val="20"/>
+          <w:lang w:val="en-US" w:eastAsia="pt-BR"/>
+          <w14:ligatures w14:val="none"/>
+        </w:rPr>
+        <w:t>product_id</w:t>
       </w:r>
       <w:proofErr w:type="spellEnd"/>
       <w:r>
@@ -3695,7 +3598,7 @@
           <w:kern w:val="0"/>
           <w:sz w:val="20"/>
           <w:szCs w:val="20"/>
-          <w:lang w:eastAsia="pt-BR"/>
+          <w:lang w:val="en-US" w:eastAsia="pt-BR"/>
           <w14:ligatures w14:val="none"/>
         </w:rPr>
         <w:t xml:space="preserve"> (FK)</w:t>
@@ -3727,36 +3630,21 @@
           <w:kern w:val="0"/>
           <w:sz w:val="20"/>
           <w:szCs w:val="20"/>
-          <w:lang w:eastAsia="pt-BR"/>
-          <w14:ligatures w14:val="none"/>
-        </w:rPr>
-      </w:pPr>
-      <w:r>
-        <w:rPr>
-          <w:rFonts w:ascii="Courier New" w:eastAsia="Times New Roman" w:hAnsi="Courier New" w:cs="Courier New"/>
-          <w:kern w:val="0"/>
-          <w:sz w:val="20"/>
-          <w:szCs w:val="20"/>
-          <w:lang w:eastAsia="pt-BR"/>
-          <w14:ligatures w14:val="none"/>
-        </w:rPr>
-        <w:t xml:space="preserve">- </w:t>
-      </w:r>
-      <w:proofErr w:type="spellStart"/>
-      <w:proofErr w:type="gramStart"/>
-      <w:r>
-        <w:rPr>
-          <w:rFonts w:ascii="Courier New" w:eastAsia="Times New Roman" w:hAnsi="Courier New" w:cs="Courier New"/>
-          <w:kern w:val="0"/>
-          <w:sz w:val="20"/>
-          <w:szCs w:val="20"/>
-          <w:lang w:eastAsia="pt-BR"/>
-          <w14:ligatures w14:val="none"/>
-        </w:rPr>
-        <w:t>name</w:t>
-      </w:r>
-      <w:proofErr w:type="spellEnd"/>
-      <w:proofErr w:type="gramEnd"/>
+          <w:lang w:val="en-US" w:eastAsia="pt-BR"/>
+          <w14:ligatures w14:val="none"/>
+        </w:rPr>
+      </w:pPr>
+      <w:r>
+        <w:rPr>
+          <w:rFonts w:ascii="Courier New" w:eastAsia="Times New Roman" w:hAnsi="Courier New" w:cs="Courier New"/>
+          <w:kern w:val="0"/>
+          <w:sz w:val="20"/>
+          <w:szCs w:val="20"/>
+          <w:lang w:val="en-US" w:eastAsia="pt-BR"/>
+          <w14:ligatures w14:val="none"/>
+        </w:rPr>
+        <w:t>- name</w:t>
+      </w:r>
     </w:p>
     <w:p>
       <w:pPr>
@@ -3784,46 +3672,33 @@
           <w:kern w:val="0"/>
           <w:sz w:val="20"/>
           <w:szCs w:val="20"/>
-          <w:lang w:eastAsia="pt-BR"/>
-          <w14:ligatures w14:val="none"/>
-        </w:rPr>
-      </w:pPr>
-      <w:r>
-        <w:rPr>
-          <w:rFonts w:ascii="Courier New" w:eastAsia="Times New Roman" w:hAnsi="Courier New" w:cs="Courier New"/>
-          <w:kern w:val="0"/>
-          <w:sz w:val="20"/>
-          <w:szCs w:val="20"/>
-          <w:lang w:eastAsia="pt-BR"/>
+          <w:lang w:val="en-US" w:eastAsia="pt-BR"/>
+          <w14:ligatures w14:val="none"/>
+        </w:rPr>
+      </w:pPr>
+      <w:r>
+        <w:rPr>
+          <w:rFonts w:ascii="Courier New" w:eastAsia="Times New Roman" w:hAnsi="Courier New" w:cs="Courier New"/>
+          <w:kern w:val="0"/>
+          <w:sz w:val="20"/>
+          <w:szCs w:val="20"/>
+          <w:lang w:val="en-US" w:eastAsia="pt-BR"/>
           <w14:ligatures w14:val="none"/>
         </w:rPr>
         <w:lastRenderedPageBreak/>
         <w:t xml:space="preserve">- </w:t>
       </w:r>
       <w:proofErr w:type="spellStart"/>
-      <w:proofErr w:type="gramStart"/>
-      <w:r>
-        <w:rPr>
-          <w:rFonts w:ascii="Courier New" w:eastAsia="Times New Roman" w:hAnsi="Courier New" w:cs="Courier New"/>
-          <w:kern w:val="0"/>
-          <w:sz w:val="20"/>
-          <w:szCs w:val="20"/>
-          <w:lang w:eastAsia="pt-BR"/>
-          <w14:ligatures w14:val="none"/>
-        </w:rPr>
-        <w:t>additional</w:t>
-      </w:r>
-      <w:proofErr w:type="gramEnd"/>
-      <w:r>
-        <w:rPr>
-          <w:rFonts w:ascii="Courier New" w:eastAsia="Times New Roman" w:hAnsi="Courier New" w:cs="Courier New"/>
-          <w:kern w:val="0"/>
-          <w:sz w:val="20"/>
-          <w:szCs w:val="20"/>
-          <w:lang w:eastAsia="pt-BR"/>
-          <w14:ligatures w14:val="none"/>
-        </w:rPr>
-        <w:t>_price</w:t>
+      <w:r>
+        <w:rPr>
+          <w:rFonts w:ascii="Courier New" w:eastAsia="Times New Roman" w:hAnsi="Courier New" w:cs="Courier New"/>
+          <w:kern w:val="0"/>
+          <w:sz w:val="20"/>
+          <w:szCs w:val="20"/>
+          <w:lang w:val="en-US" w:eastAsia="pt-BR"/>
+          <w14:ligatures w14:val="none"/>
+        </w:rPr>
+        <w:t>additional_price</w:t>
       </w:r>
       <w:proofErr w:type="spellEnd"/>
     </w:p>
@@ -3957,7 +3832,7 @@
           <w14:ligatures w14:val="none"/>
         </w:rPr>
         <w:pict w14:anchorId="7C55CF5F">
-          <v:rect id="_x0000_i1123" style="width:0;height:1.5pt" o:hralign="center" o:hrstd="t" o:hr="t" fillcolor="#a0a0a0" stroked="f"/>
+          <v:rect id="_x0000_i1031" style="width:0;height:1.5pt" o:hralign="center" o:hrstd="t" o:hr="t" fillcolor="#a0a0a0" stroked="f"/>
         </w:pict>
       </w:r>
     </w:p>
@@ -4376,34 +4251,21 @@
           <w:kern w:val="0"/>
           <w:sz w:val="20"/>
           <w:szCs w:val="20"/>
-          <w:lang w:eastAsia="pt-BR"/>
-          <w14:ligatures w14:val="none"/>
-        </w:rPr>
-      </w:pPr>
-      <w:r>
-        <w:rPr>
-          <w:rFonts w:ascii="Courier New" w:eastAsia="Times New Roman" w:hAnsi="Courier New" w:cs="Courier New"/>
-          <w:kern w:val="0"/>
-          <w:sz w:val="20"/>
-          <w:szCs w:val="20"/>
-          <w:lang w:eastAsia="pt-BR"/>
-          <w14:ligatures w14:val="none"/>
-        </w:rPr>
-        <w:t xml:space="preserve">- </w:t>
-      </w:r>
-      <w:proofErr w:type="gramStart"/>
-      <w:r>
-        <w:rPr>
-          <w:rFonts w:ascii="Courier New" w:eastAsia="Times New Roman" w:hAnsi="Courier New" w:cs="Courier New"/>
-          <w:kern w:val="0"/>
-          <w:sz w:val="20"/>
-          <w:szCs w:val="20"/>
-          <w:lang w:eastAsia="pt-BR"/>
-          <w14:ligatures w14:val="none"/>
-        </w:rPr>
-        <w:t>id</w:t>
-      </w:r>
-      <w:proofErr w:type="gramEnd"/>
+          <w:lang w:val="en-US" w:eastAsia="pt-BR"/>
+          <w14:ligatures w14:val="none"/>
+        </w:rPr>
+      </w:pPr>
+      <w:r>
+        <w:rPr>
+          <w:rFonts w:ascii="Courier New" w:eastAsia="Times New Roman" w:hAnsi="Courier New" w:cs="Courier New"/>
+          <w:kern w:val="0"/>
+          <w:sz w:val="20"/>
+          <w:szCs w:val="20"/>
+          <w:lang w:val="en-US" w:eastAsia="pt-BR"/>
+          <w14:ligatures w14:val="none"/>
+        </w:rPr>
+        <w:t>- id</w:t>
+      </w:r>
     </w:p>
     <w:p>
       <w:pPr>
@@ -4431,45 +4293,32 @@
           <w:kern w:val="0"/>
           <w:sz w:val="20"/>
           <w:szCs w:val="20"/>
-          <w:lang w:eastAsia="pt-BR"/>
-          <w14:ligatures w14:val="none"/>
-        </w:rPr>
-      </w:pPr>
-      <w:r>
-        <w:rPr>
-          <w:rFonts w:ascii="Courier New" w:eastAsia="Times New Roman" w:hAnsi="Courier New" w:cs="Courier New"/>
-          <w:kern w:val="0"/>
-          <w:sz w:val="20"/>
-          <w:szCs w:val="20"/>
-          <w:lang w:eastAsia="pt-BR"/>
+          <w:lang w:val="en-US" w:eastAsia="pt-BR"/>
+          <w14:ligatures w14:val="none"/>
+        </w:rPr>
+      </w:pPr>
+      <w:r>
+        <w:rPr>
+          <w:rFonts w:ascii="Courier New" w:eastAsia="Times New Roman" w:hAnsi="Courier New" w:cs="Courier New"/>
+          <w:kern w:val="0"/>
+          <w:sz w:val="20"/>
+          <w:szCs w:val="20"/>
+          <w:lang w:val="en-US" w:eastAsia="pt-BR"/>
           <w14:ligatures w14:val="none"/>
         </w:rPr>
         <w:t xml:space="preserve">- </w:t>
       </w:r>
       <w:proofErr w:type="spellStart"/>
-      <w:proofErr w:type="gramStart"/>
-      <w:r>
-        <w:rPr>
-          <w:rFonts w:ascii="Courier New" w:eastAsia="Times New Roman" w:hAnsi="Courier New" w:cs="Courier New"/>
-          <w:kern w:val="0"/>
-          <w:sz w:val="20"/>
-          <w:szCs w:val="20"/>
-          <w:lang w:eastAsia="pt-BR"/>
-          <w14:ligatures w14:val="none"/>
-        </w:rPr>
-        <w:t>user</w:t>
-      </w:r>
-      <w:proofErr w:type="gramEnd"/>
-      <w:r>
-        <w:rPr>
-          <w:rFonts w:ascii="Courier New" w:eastAsia="Times New Roman" w:hAnsi="Courier New" w:cs="Courier New"/>
-          <w:kern w:val="0"/>
-          <w:sz w:val="20"/>
-          <w:szCs w:val="20"/>
-          <w:lang w:eastAsia="pt-BR"/>
-          <w14:ligatures w14:val="none"/>
-        </w:rPr>
-        <w:t>_id</w:t>
+      <w:r>
+        <w:rPr>
+          <w:rFonts w:ascii="Courier New" w:eastAsia="Times New Roman" w:hAnsi="Courier New" w:cs="Courier New"/>
+          <w:kern w:val="0"/>
+          <w:sz w:val="20"/>
+          <w:szCs w:val="20"/>
+          <w:lang w:val="en-US" w:eastAsia="pt-BR"/>
+          <w14:ligatures w14:val="none"/>
+        </w:rPr>
+        <w:t>user_id</w:t>
       </w:r>
       <w:proofErr w:type="spellEnd"/>
       <w:r>
@@ -4478,7 +4327,7 @@
           <w:kern w:val="0"/>
           <w:sz w:val="20"/>
           <w:szCs w:val="20"/>
-          <w:lang w:eastAsia="pt-BR"/>
+          <w:lang w:val="en-US" w:eastAsia="pt-BR"/>
           <w14:ligatures w14:val="none"/>
         </w:rPr>
         <w:t xml:space="preserve"> (FK)</w:t>
@@ -4510,34 +4359,21 @@
           <w:kern w:val="0"/>
           <w:sz w:val="20"/>
           <w:szCs w:val="20"/>
-          <w:lang w:eastAsia="pt-BR"/>
-          <w14:ligatures w14:val="none"/>
-        </w:rPr>
-      </w:pPr>
-      <w:r>
-        <w:rPr>
-          <w:rFonts w:ascii="Courier New" w:eastAsia="Times New Roman" w:hAnsi="Courier New" w:cs="Courier New"/>
-          <w:kern w:val="0"/>
-          <w:sz w:val="20"/>
-          <w:szCs w:val="20"/>
-          <w:lang w:eastAsia="pt-BR"/>
-          <w14:ligatures w14:val="none"/>
-        </w:rPr>
-        <w:t xml:space="preserve">- </w:t>
-      </w:r>
-      <w:proofErr w:type="gramStart"/>
-      <w:r>
-        <w:rPr>
-          <w:rFonts w:ascii="Courier New" w:eastAsia="Times New Roman" w:hAnsi="Courier New" w:cs="Courier New"/>
-          <w:kern w:val="0"/>
-          <w:sz w:val="20"/>
-          <w:szCs w:val="20"/>
-          <w:lang w:eastAsia="pt-BR"/>
-          <w14:ligatures w14:val="none"/>
-        </w:rPr>
-        <w:t>status</w:t>
-      </w:r>
-      <w:proofErr w:type="gramEnd"/>
+          <w:lang w:val="en-US" w:eastAsia="pt-BR"/>
+          <w14:ligatures w14:val="none"/>
+        </w:rPr>
+      </w:pPr>
+      <w:r>
+        <w:rPr>
+          <w:rFonts w:ascii="Courier New" w:eastAsia="Times New Roman" w:hAnsi="Courier New" w:cs="Courier New"/>
+          <w:kern w:val="0"/>
+          <w:sz w:val="20"/>
+          <w:szCs w:val="20"/>
+          <w:lang w:val="en-US" w:eastAsia="pt-BR"/>
+          <w14:ligatures w14:val="none"/>
+        </w:rPr>
+        <w:t>- status</w:t>
+      </w:r>
     </w:p>
     <w:p>
       <w:pPr>
@@ -4565,34 +4401,21 @@
           <w:kern w:val="0"/>
           <w:sz w:val="20"/>
           <w:szCs w:val="20"/>
-          <w:lang w:eastAsia="pt-BR"/>
-          <w14:ligatures w14:val="none"/>
-        </w:rPr>
-      </w:pPr>
-      <w:r>
-        <w:rPr>
-          <w:rFonts w:ascii="Courier New" w:eastAsia="Times New Roman" w:hAnsi="Courier New" w:cs="Courier New"/>
-          <w:kern w:val="0"/>
-          <w:sz w:val="20"/>
-          <w:szCs w:val="20"/>
-          <w:lang w:eastAsia="pt-BR"/>
-          <w14:ligatures w14:val="none"/>
-        </w:rPr>
-        <w:t xml:space="preserve">- </w:t>
-      </w:r>
-      <w:proofErr w:type="gramStart"/>
-      <w:r>
-        <w:rPr>
-          <w:rFonts w:ascii="Courier New" w:eastAsia="Times New Roman" w:hAnsi="Courier New" w:cs="Courier New"/>
-          <w:kern w:val="0"/>
-          <w:sz w:val="20"/>
-          <w:szCs w:val="20"/>
-          <w:lang w:eastAsia="pt-BR"/>
-          <w14:ligatures w14:val="none"/>
-        </w:rPr>
-        <w:t>total</w:t>
-      </w:r>
-      <w:proofErr w:type="gramEnd"/>
+          <w:lang w:val="en-US" w:eastAsia="pt-BR"/>
+          <w14:ligatures w14:val="none"/>
+        </w:rPr>
+      </w:pPr>
+      <w:r>
+        <w:rPr>
+          <w:rFonts w:ascii="Courier New" w:eastAsia="Times New Roman" w:hAnsi="Courier New" w:cs="Courier New"/>
+          <w:kern w:val="0"/>
+          <w:sz w:val="20"/>
+          <w:szCs w:val="20"/>
+          <w:lang w:val="en-US" w:eastAsia="pt-BR"/>
+          <w14:ligatures w14:val="none"/>
+        </w:rPr>
+        <w:t>- total</w:t>
+      </w:r>
     </w:p>
     <w:p>
       <w:pPr>
@@ -4684,7 +4507,7 @@
           <w14:ligatures w14:val="none"/>
         </w:rPr>
         <w:pict w14:anchorId="03016C32">
-          <v:rect id="_x0000_i1124" style="width:0;height:1.5pt" o:hralign="center" o:hrstd="t" o:hr="t" fillcolor="#a0a0a0" stroked="f"/>
+          <v:rect id="_x0000_i1032" style="width:0;height:1.5pt" o:hralign="center" o:hrstd="t" o:hr="t" fillcolor="#a0a0a0" stroked="f"/>
         </w:pict>
       </w:r>
     </w:p>
@@ -5113,7 +4936,7 @@
           <w14:ligatures w14:val="none"/>
         </w:rPr>
         <w:pict w14:anchorId="68A0773A">
-          <v:rect id="_x0000_i1125" style="width:0;height:1.5pt" o:hralign="center" o:hrstd="t" o:hr="t" fillcolor="#a0a0a0" stroked="f"/>
+          <v:rect id="_x0000_i1033" style="width:0;height:1.5pt" o:hralign="center" o:hrstd="t" o:hr="t" fillcolor="#a0a0a0" stroked="f"/>
         </w:pict>
       </w:r>
     </w:p>
@@ -5526,34 +5349,21 @@
           <w:kern w:val="0"/>
           <w:sz w:val="20"/>
           <w:szCs w:val="20"/>
-          <w:lang w:eastAsia="pt-BR"/>
-          <w14:ligatures w14:val="none"/>
-        </w:rPr>
-      </w:pPr>
-      <w:r>
-        <w:rPr>
-          <w:rFonts w:ascii="Courier New" w:eastAsia="Times New Roman" w:hAnsi="Courier New" w:cs="Courier New"/>
-          <w:kern w:val="0"/>
-          <w:sz w:val="20"/>
-          <w:szCs w:val="20"/>
-          <w:lang w:eastAsia="pt-BR"/>
-          <w14:ligatures w14:val="none"/>
-        </w:rPr>
-        <w:t xml:space="preserve">- </w:t>
-      </w:r>
-      <w:proofErr w:type="gramStart"/>
-      <w:r>
-        <w:rPr>
-          <w:rFonts w:ascii="Courier New" w:eastAsia="Times New Roman" w:hAnsi="Courier New" w:cs="Courier New"/>
-          <w:kern w:val="0"/>
-          <w:sz w:val="20"/>
-          <w:szCs w:val="20"/>
-          <w:lang w:eastAsia="pt-BR"/>
-          <w14:ligatures w14:val="none"/>
-        </w:rPr>
-        <w:t>id</w:t>
-      </w:r>
-      <w:proofErr w:type="gramEnd"/>
+          <w:lang w:val="en-US" w:eastAsia="pt-BR"/>
+          <w14:ligatures w14:val="none"/>
+        </w:rPr>
+      </w:pPr>
+      <w:r>
+        <w:rPr>
+          <w:rFonts w:ascii="Courier New" w:eastAsia="Times New Roman" w:hAnsi="Courier New" w:cs="Courier New"/>
+          <w:kern w:val="0"/>
+          <w:sz w:val="20"/>
+          <w:szCs w:val="20"/>
+          <w:lang w:val="en-US" w:eastAsia="pt-BR"/>
+          <w14:ligatures w14:val="none"/>
+        </w:rPr>
+        <w:t>- id</w:t>
+      </w:r>
     </w:p>
     <w:p>
       <w:pPr>
@@ -5581,45 +5391,32 @@
           <w:kern w:val="0"/>
           <w:sz w:val="20"/>
           <w:szCs w:val="20"/>
-          <w:lang w:eastAsia="pt-BR"/>
-          <w14:ligatures w14:val="none"/>
-        </w:rPr>
-      </w:pPr>
-      <w:r>
-        <w:rPr>
-          <w:rFonts w:ascii="Courier New" w:eastAsia="Times New Roman" w:hAnsi="Courier New" w:cs="Courier New"/>
-          <w:kern w:val="0"/>
-          <w:sz w:val="20"/>
-          <w:szCs w:val="20"/>
-          <w:lang w:eastAsia="pt-BR"/>
+          <w:lang w:val="en-US" w:eastAsia="pt-BR"/>
+          <w14:ligatures w14:val="none"/>
+        </w:rPr>
+      </w:pPr>
+      <w:r>
+        <w:rPr>
+          <w:rFonts w:ascii="Courier New" w:eastAsia="Times New Roman" w:hAnsi="Courier New" w:cs="Courier New"/>
+          <w:kern w:val="0"/>
+          <w:sz w:val="20"/>
+          <w:szCs w:val="20"/>
+          <w:lang w:val="en-US" w:eastAsia="pt-BR"/>
           <w14:ligatures w14:val="none"/>
         </w:rPr>
         <w:t xml:space="preserve">- </w:t>
       </w:r>
       <w:proofErr w:type="spellStart"/>
-      <w:proofErr w:type="gramStart"/>
-      <w:r>
-        <w:rPr>
-          <w:rFonts w:ascii="Courier New" w:eastAsia="Times New Roman" w:hAnsi="Courier New" w:cs="Courier New"/>
-          <w:kern w:val="0"/>
-          <w:sz w:val="20"/>
-          <w:szCs w:val="20"/>
-          <w:lang w:eastAsia="pt-BR"/>
-          <w14:ligatures w14:val="none"/>
-        </w:rPr>
-        <w:t>order</w:t>
-      </w:r>
-      <w:proofErr w:type="gramEnd"/>
-      <w:r>
-        <w:rPr>
-          <w:rFonts w:ascii="Courier New" w:eastAsia="Times New Roman" w:hAnsi="Courier New" w:cs="Courier New"/>
-          <w:kern w:val="0"/>
-          <w:sz w:val="20"/>
-          <w:szCs w:val="20"/>
-          <w:lang w:eastAsia="pt-BR"/>
-          <w14:ligatures w14:val="none"/>
-        </w:rPr>
-        <w:t>_id</w:t>
+      <w:r>
+        <w:rPr>
+          <w:rFonts w:ascii="Courier New" w:eastAsia="Times New Roman" w:hAnsi="Courier New" w:cs="Courier New"/>
+          <w:kern w:val="0"/>
+          <w:sz w:val="20"/>
+          <w:szCs w:val="20"/>
+          <w:lang w:val="en-US" w:eastAsia="pt-BR"/>
+          <w14:ligatures w14:val="none"/>
+        </w:rPr>
+        <w:t>order_id</w:t>
       </w:r>
       <w:proofErr w:type="spellEnd"/>
       <w:r>
@@ -5628,7 +5425,7 @@
           <w:kern w:val="0"/>
           <w:sz w:val="20"/>
           <w:szCs w:val="20"/>
-          <w:lang w:eastAsia="pt-BR"/>
+          <w:lang w:val="en-US" w:eastAsia="pt-BR"/>
           <w14:ligatures w14:val="none"/>
         </w:rPr>
         <w:t xml:space="preserve"> (FK)</w:t>
@@ -5660,45 +5457,32 @@
           <w:kern w:val="0"/>
           <w:sz w:val="20"/>
           <w:szCs w:val="20"/>
-          <w:lang w:eastAsia="pt-BR"/>
-          <w14:ligatures w14:val="none"/>
-        </w:rPr>
-      </w:pPr>
-      <w:r>
-        <w:rPr>
-          <w:rFonts w:ascii="Courier New" w:eastAsia="Times New Roman" w:hAnsi="Courier New" w:cs="Courier New"/>
-          <w:kern w:val="0"/>
-          <w:sz w:val="20"/>
-          <w:szCs w:val="20"/>
-          <w:lang w:eastAsia="pt-BR"/>
+          <w:lang w:val="en-US" w:eastAsia="pt-BR"/>
+          <w14:ligatures w14:val="none"/>
+        </w:rPr>
+      </w:pPr>
+      <w:r>
+        <w:rPr>
+          <w:rFonts w:ascii="Courier New" w:eastAsia="Times New Roman" w:hAnsi="Courier New" w:cs="Courier New"/>
+          <w:kern w:val="0"/>
+          <w:sz w:val="20"/>
+          <w:szCs w:val="20"/>
+          <w:lang w:val="en-US" w:eastAsia="pt-BR"/>
           <w14:ligatures w14:val="none"/>
         </w:rPr>
         <w:t xml:space="preserve">- </w:t>
       </w:r>
       <w:proofErr w:type="spellStart"/>
-      <w:proofErr w:type="gramStart"/>
-      <w:r>
-        <w:rPr>
-          <w:rFonts w:ascii="Courier New" w:eastAsia="Times New Roman" w:hAnsi="Courier New" w:cs="Courier New"/>
-          <w:kern w:val="0"/>
-          <w:sz w:val="20"/>
-          <w:szCs w:val="20"/>
-          <w:lang w:eastAsia="pt-BR"/>
-          <w14:ligatures w14:val="none"/>
-        </w:rPr>
-        <w:t>product</w:t>
-      </w:r>
-      <w:proofErr w:type="gramEnd"/>
-      <w:r>
-        <w:rPr>
-          <w:rFonts w:ascii="Courier New" w:eastAsia="Times New Roman" w:hAnsi="Courier New" w:cs="Courier New"/>
-          <w:kern w:val="0"/>
-          <w:sz w:val="20"/>
-          <w:szCs w:val="20"/>
-          <w:lang w:eastAsia="pt-BR"/>
-          <w14:ligatures w14:val="none"/>
-        </w:rPr>
-        <w:t>_id</w:t>
+      <w:r>
+        <w:rPr>
+          <w:rFonts w:ascii="Courier New" w:eastAsia="Times New Roman" w:hAnsi="Courier New" w:cs="Courier New"/>
+          <w:kern w:val="0"/>
+          <w:sz w:val="20"/>
+          <w:szCs w:val="20"/>
+          <w:lang w:val="en-US" w:eastAsia="pt-BR"/>
+          <w14:ligatures w14:val="none"/>
+        </w:rPr>
+        <w:t>product_id</w:t>
       </w:r>
       <w:proofErr w:type="spellEnd"/>
       <w:r>
@@ -5707,7 +5491,7 @@
           <w:kern w:val="0"/>
           <w:sz w:val="20"/>
           <w:szCs w:val="20"/>
-          <w:lang w:eastAsia="pt-BR"/>
+          <w:lang w:val="en-US" w:eastAsia="pt-BR"/>
           <w14:ligatures w14:val="none"/>
         </w:rPr>
         <w:t xml:space="preserve"> (FK)</w:t>
@@ -5895,7 +5679,7 @@
           <w14:ligatures w14:val="none"/>
         </w:rPr>
         <w:pict w14:anchorId="6F0AEDB2">
-          <v:rect id="_x0000_i1126" style="width:0;height:1.5pt" o:hralign="center" o:hrstd="t" o:hr="t" fillcolor="#a0a0a0" stroked="f"/>
+          <v:rect id="_x0000_i1034" style="width:0;height:1.5pt" o:hralign="center" o:hrstd="t" o:hr="t" fillcolor="#a0a0a0" stroked="f"/>
         </w:pict>
       </w:r>
     </w:p>
@@ -6287,34 +6071,21 @@
           <w:kern w:val="0"/>
           <w:sz w:val="20"/>
           <w:szCs w:val="20"/>
-          <w:lang w:eastAsia="pt-BR"/>
-          <w14:ligatures w14:val="none"/>
-        </w:rPr>
-      </w:pPr>
-      <w:r>
-        <w:rPr>
-          <w:rFonts w:ascii="Courier New" w:eastAsia="Times New Roman" w:hAnsi="Courier New" w:cs="Courier New"/>
-          <w:kern w:val="0"/>
-          <w:sz w:val="20"/>
-          <w:szCs w:val="20"/>
-          <w:lang w:eastAsia="pt-BR"/>
-          <w14:ligatures w14:val="none"/>
-        </w:rPr>
-        <w:t xml:space="preserve">- </w:t>
-      </w:r>
-      <w:proofErr w:type="gramStart"/>
-      <w:r>
-        <w:rPr>
-          <w:rFonts w:ascii="Courier New" w:eastAsia="Times New Roman" w:hAnsi="Courier New" w:cs="Courier New"/>
-          <w:kern w:val="0"/>
-          <w:sz w:val="20"/>
-          <w:szCs w:val="20"/>
-          <w:lang w:eastAsia="pt-BR"/>
-          <w14:ligatures w14:val="none"/>
-        </w:rPr>
-        <w:t>id</w:t>
-      </w:r>
-      <w:proofErr w:type="gramEnd"/>
+          <w:lang w:val="en-US" w:eastAsia="pt-BR"/>
+          <w14:ligatures w14:val="none"/>
+        </w:rPr>
+      </w:pPr>
+      <w:r>
+        <w:rPr>
+          <w:rFonts w:ascii="Courier New" w:eastAsia="Times New Roman" w:hAnsi="Courier New" w:cs="Courier New"/>
+          <w:kern w:val="0"/>
+          <w:sz w:val="20"/>
+          <w:szCs w:val="20"/>
+          <w:lang w:val="en-US" w:eastAsia="pt-BR"/>
+          <w14:ligatures w14:val="none"/>
+        </w:rPr>
+        <w:t>- id</w:t>
+      </w:r>
     </w:p>
     <w:p>
       <w:pPr>
@@ -6342,45 +6113,32 @@
           <w:kern w:val="0"/>
           <w:sz w:val="20"/>
           <w:szCs w:val="20"/>
-          <w:lang w:eastAsia="pt-BR"/>
-          <w14:ligatures w14:val="none"/>
-        </w:rPr>
-      </w:pPr>
-      <w:r>
-        <w:rPr>
-          <w:rFonts w:ascii="Courier New" w:eastAsia="Times New Roman" w:hAnsi="Courier New" w:cs="Courier New"/>
-          <w:kern w:val="0"/>
-          <w:sz w:val="20"/>
-          <w:szCs w:val="20"/>
-          <w:lang w:eastAsia="pt-BR"/>
+          <w:lang w:val="en-US" w:eastAsia="pt-BR"/>
+          <w14:ligatures w14:val="none"/>
+        </w:rPr>
+      </w:pPr>
+      <w:r>
+        <w:rPr>
+          <w:rFonts w:ascii="Courier New" w:eastAsia="Times New Roman" w:hAnsi="Courier New" w:cs="Courier New"/>
+          <w:kern w:val="0"/>
+          <w:sz w:val="20"/>
+          <w:szCs w:val="20"/>
+          <w:lang w:val="en-US" w:eastAsia="pt-BR"/>
           <w14:ligatures w14:val="none"/>
         </w:rPr>
         <w:t xml:space="preserve">- </w:t>
       </w:r>
       <w:proofErr w:type="spellStart"/>
-      <w:proofErr w:type="gramStart"/>
-      <w:r>
-        <w:rPr>
-          <w:rFonts w:ascii="Courier New" w:eastAsia="Times New Roman" w:hAnsi="Courier New" w:cs="Courier New"/>
-          <w:kern w:val="0"/>
-          <w:sz w:val="20"/>
-          <w:szCs w:val="20"/>
-          <w:lang w:eastAsia="pt-BR"/>
-          <w14:ligatures w14:val="none"/>
-        </w:rPr>
-        <w:t>order</w:t>
-      </w:r>
-      <w:proofErr w:type="gramEnd"/>
-      <w:r>
-        <w:rPr>
-          <w:rFonts w:ascii="Courier New" w:eastAsia="Times New Roman" w:hAnsi="Courier New" w:cs="Courier New"/>
-          <w:kern w:val="0"/>
-          <w:sz w:val="20"/>
-          <w:szCs w:val="20"/>
-          <w:lang w:eastAsia="pt-BR"/>
-          <w14:ligatures w14:val="none"/>
-        </w:rPr>
-        <w:t>_id</w:t>
+      <w:r>
+        <w:rPr>
+          <w:rFonts w:ascii="Courier New" w:eastAsia="Times New Roman" w:hAnsi="Courier New" w:cs="Courier New"/>
+          <w:kern w:val="0"/>
+          <w:sz w:val="20"/>
+          <w:szCs w:val="20"/>
+          <w:lang w:val="en-US" w:eastAsia="pt-BR"/>
+          <w14:ligatures w14:val="none"/>
+        </w:rPr>
+        <w:t>order_id</w:t>
       </w:r>
       <w:proofErr w:type="spellEnd"/>
       <w:r>
@@ -6389,7 +6147,7 @@
           <w:kern w:val="0"/>
           <w:sz w:val="20"/>
           <w:szCs w:val="20"/>
-          <w:lang w:eastAsia="pt-BR"/>
+          <w:lang w:val="en-US" w:eastAsia="pt-BR"/>
           <w14:ligatures w14:val="none"/>
         </w:rPr>
         <w:t xml:space="preserve"> (FK)</w:t>
@@ -6421,36 +6179,21 @@
           <w:kern w:val="0"/>
           <w:sz w:val="20"/>
           <w:szCs w:val="20"/>
-          <w:lang w:eastAsia="pt-BR"/>
-          <w14:ligatures w14:val="none"/>
-        </w:rPr>
-      </w:pPr>
-      <w:r>
-        <w:rPr>
-          <w:rFonts w:ascii="Courier New" w:eastAsia="Times New Roman" w:hAnsi="Courier New" w:cs="Courier New"/>
-          <w:kern w:val="0"/>
-          <w:sz w:val="20"/>
-          <w:szCs w:val="20"/>
-          <w:lang w:eastAsia="pt-BR"/>
-          <w14:ligatures w14:val="none"/>
-        </w:rPr>
-        <w:t xml:space="preserve">- </w:t>
-      </w:r>
-      <w:proofErr w:type="spellStart"/>
-      <w:proofErr w:type="gramStart"/>
-      <w:r>
-        <w:rPr>
-          <w:rFonts w:ascii="Courier New" w:eastAsia="Times New Roman" w:hAnsi="Courier New" w:cs="Courier New"/>
-          <w:kern w:val="0"/>
-          <w:sz w:val="20"/>
-          <w:szCs w:val="20"/>
-          <w:lang w:eastAsia="pt-BR"/>
-          <w14:ligatures w14:val="none"/>
-        </w:rPr>
-        <w:t>method</w:t>
-      </w:r>
-      <w:proofErr w:type="spellEnd"/>
-      <w:proofErr w:type="gramEnd"/>
+          <w:lang w:val="en-US" w:eastAsia="pt-BR"/>
+          <w14:ligatures w14:val="none"/>
+        </w:rPr>
+      </w:pPr>
+      <w:r>
+        <w:rPr>
+          <w:rFonts w:ascii="Courier New" w:eastAsia="Times New Roman" w:hAnsi="Courier New" w:cs="Courier New"/>
+          <w:kern w:val="0"/>
+          <w:sz w:val="20"/>
+          <w:szCs w:val="20"/>
+          <w:lang w:val="en-US" w:eastAsia="pt-BR"/>
+          <w14:ligatures w14:val="none"/>
+        </w:rPr>
+        <w:t>- method</w:t>
+      </w:r>
     </w:p>
     <w:p>
       <w:pPr>
@@ -6478,34 +6221,21 @@
           <w:kern w:val="0"/>
           <w:sz w:val="20"/>
           <w:szCs w:val="20"/>
-          <w:lang w:eastAsia="pt-BR"/>
-          <w14:ligatures w14:val="none"/>
-        </w:rPr>
-      </w:pPr>
-      <w:r>
-        <w:rPr>
-          <w:rFonts w:ascii="Courier New" w:eastAsia="Times New Roman" w:hAnsi="Courier New" w:cs="Courier New"/>
-          <w:kern w:val="0"/>
-          <w:sz w:val="20"/>
-          <w:szCs w:val="20"/>
-          <w:lang w:eastAsia="pt-BR"/>
-          <w14:ligatures w14:val="none"/>
-        </w:rPr>
-        <w:t xml:space="preserve">- </w:t>
-      </w:r>
-      <w:proofErr w:type="gramStart"/>
-      <w:r>
-        <w:rPr>
-          <w:rFonts w:ascii="Courier New" w:eastAsia="Times New Roman" w:hAnsi="Courier New" w:cs="Courier New"/>
-          <w:kern w:val="0"/>
-          <w:sz w:val="20"/>
-          <w:szCs w:val="20"/>
-          <w:lang w:eastAsia="pt-BR"/>
-          <w14:ligatures w14:val="none"/>
-        </w:rPr>
-        <w:t>status</w:t>
-      </w:r>
-      <w:proofErr w:type="gramEnd"/>
+          <w:lang w:val="en-US" w:eastAsia="pt-BR"/>
+          <w14:ligatures w14:val="none"/>
+        </w:rPr>
+      </w:pPr>
+      <w:r>
+        <w:rPr>
+          <w:rFonts w:ascii="Courier New" w:eastAsia="Times New Roman" w:hAnsi="Courier New" w:cs="Courier New"/>
+          <w:kern w:val="0"/>
+          <w:sz w:val="20"/>
+          <w:szCs w:val="20"/>
+          <w:lang w:val="en-US" w:eastAsia="pt-BR"/>
+          <w14:ligatures w14:val="none"/>
+        </w:rPr>
+        <w:t>- status</w:t>
+      </w:r>
     </w:p>
     <w:p>
       <w:pPr>
@@ -7193,7 +6923,7 @@
           <w14:ligatures w14:val="none"/>
         </w:rPr>
         <w:pict w14:anchorId="6EBE120D">
-          <v:rect id="_x0000_i1128" style="width:0;height:1.5pt" o:hralign="center" o:hrstd="t" o:hr="t" fillcolor="#a0a0a0" stroked="f"/>
+          <v:rect id="_x0000_i1035" style="width:0;height:1.5pt" o:hralign="center" o:hrstd="t" o:hr="t" fillcolor="#a0a0a0" stroked="f"/>
         </w:pict>
       </w:r>
     </w:p>
@@ -7728,7 +7458,7 @@
           <w14:ligatures w14:val="none"/>
         </w:rPr>
         <w:pict w14:anchorId="0CC77942">
-          <v:rect id="_x0000_i1129" style="width:0;height:1.5pt" o:hralign="center" o:hrstd="t" o:hr="t" fillcolor="#a0a0a0" stroked="f"/>
+          <v:rect id="_x0000_i1036" style="width:0;height:1.5pt" o:hralign="center" o:hrstd="t" o:hr="t" fillcolor="#a0a0a0" stroked="f"/>
         </w:pict>
       </w:r>
     </w:p>
@@ -8274,7 +8004,7 @@
           <w14:ligatures w14:val="none"/>
         </w:rPr>
         <w:pict w14:anchorId="5B838841">
-          <v:rect id="_x0000_i1130" style="width:0;height:1.5pt" o:hralign="center" o:hrstd="t" o:hr="t" fillcolor="#a0a0a0" stroked="f"/>
+          <v:rect id="_x0000_i1037" style="width:0;height:1.5pt" o:hralign="center" o:hrstd="t" o:hr="t" fillcolor="#a0a0a0" stroked="f"/>
         </w:pict>
       </w:r>
     </w:p>
@@ -8459,16 +8189,6 @@
       <w:pPr>
         <w:spacing w:before="100" w:beforeAutospacing="1" w:after="100" w:afterAutospacing="1" w:line="300" w:lineRule="atLeast"/>
         <w:rPr>
-          <w:rFonts w:ascii="Segoe UI" w:eastAsia="Times New Roman" w:hAnsi="Segoe UI" w:cs="Segoe UI"/>
-          <w:kern w:val="0"/>
-          <w:sz w:val="21"/>
-          <w:szCs w:val="21"/>
-          <w:lang w:eastAsia="pt-BR"/>
-          <w14:ligatures w14:val="none"/>
-        </w:rPr>
-      </w:pPr>
-      <w:r>
-        <w:rPr>
           <w:rFonts w:ascii="Segoe UI Emoji" w:eastAsia="Times New Roman" w:hAnsi="Segoe UI Emoji" w:cs="Segoe UI Emoji"/>
           <w:kern w:val="0"/>
           <w:sz w:val="21"/>
@@ -8476,6 +8196,16 @@
           <w:lang w:eastAsia="pt-BR"/>
           <w14:ligatures w14:val="none"/>
         </w:rPr>
+      </w:pPr>
+      <w:r>
+        <w:rPr>
+          <w:rFonts w:ascii="Segoe UI Emoji" w:eastAsia="Times New Roman" w:hAnsi="Segoe UI Emoji" w:cs="Segoe UI Emoji"/>
+          <w:kern w:val="0"/>
+          <w:sz w:val="21"/>
+          <w:szCs w:val="21"/>
+          <w:lang w:eastAsia="pt-BR"/>
+          <w14:ligatures w14:val="none"/>
+        </w:rPr>
         <w:t>✅</w:t>
       </w:r>
       <w:r>
@@ -8499,6 +8229,645 @@
           <w14:ligatures w14:val="none"/>
         </w:rPr>
         <w:t>👏</w:t>
+      </w:r>
+    </w:p>
+    <w:p>
+      <w:pPr>
+        <w:spacing w:before="100" w:beforeAutospacing="1" w:after="100" w:afterAutospacing="1" w:line="300" w:lineRule="atLeast"/>
+        <w:rPr>
+          <w:rFonts w:ascii="Segoe UI Emoji" w:eastAsia="Times New Roman" w:hAnsi="Segoe UI Emoji" w:cs="Segoe UI Emoji"/>
+          <w:kern w:val="0"/>
+          <w:sz w:val="21"/>
+          <w:szCs w:val="21"/>
+          <w:lang w:eastAsia="pt-BR"/>
+          <w14:ligatures w14:val="none"/>
+        </w:rPr>
+      </w:pPr>
+    </w:p>
+    <w:p>
+      <w:pPr>
+        <w:spacing w:before="100" w:beforeAutospacing="1" w:after="100" w:afterAutospacing="1" w:line="300" w:lineRule="atLeast"/>
+        <w:jc w:val="center"/>
+        <w:rPr>
+          <w:rFonts w:ascii="Segoe UI" w:eastAsia="Times New Roman" w:hAnsi="Segoe UI" w:cs="Segoe UI"/>
+          <w:b/>
+          <w:bCs/>
+          <w:kern w:val="0"/>
+          <w:sz w:val="28"/>
+          <w:szCs w:val="28"/>
+          <w:u w:val="single"/>
+          <w:lang w:eastAsia="pt-BR"/>
+          <w14:ligatures w14:val="none"/>
+        </w:rPr>
+      </w:pPr>
+      <w:r>
+        <w:rPr>
+          <w:rFonts w:ascii="Segoe UI Emoji" w:eastAsia="Times New Roman" w:hAnsi="Segoe UI Emoji" w:cs="Segoe UI Emoji"/>
+          <w:b/>
+          <w:bCs/>
+          <w:kern w:val="0"/>
+          <w:sz w:val="28"/>
+          <w:szCs w:val="28"/>
+          <w:u w:val="single"/>
+          <w:lang w:eastAsia="pt-BR"/>
+          <w14:ligatures w14:val="none"/>
+        </w:rPr>
+        <w:t>ARQUITETURA DE GERÊNCIAMENTO DO SISTEMA</w:t>
+      </w:r>
+    </w:p>
+    <w:p>
+      <w:pPr>
+        <w:spacing w:after="0" w:line="240" w:lineRule="auto"/>
+        <w:rPr>
+          <w:rFonts w:ascii="Times New Roman" w:eastAsia="Times New Roman" w:hAnsi="Times New Roman" w:cs="Times New Roman"/>
+          <w:kern w:val="0"/>
+          <w:sz w:val="24"/>
+          <w:szCs w:val="24"/>
+          <w:lang w:eastAsia="pt-BR"/>
+          <w14:ligatures w14:val="none"/>
+        </w:rPr>
+      </w:pPr>
+    </w:p>
+    <w:p>
+      <w:pPr>
+        <w:spacing w:after="0" w:line="240" w:lineRule="auto"/>
+        <w:rPr>
+          <w:rFonts w:ascii="Times New Roman" w:eastAsia="Times New Roman" w:hAnsi="Times New Roman" w:cs="Times New Roman"/>
+          <w:kern w:val="0"/>
+          <w:sz w:val="24"/>
+          <w:szCs w:val="24"/>
+          <w:lang w:eastAsia="pt-BR"/>
+          <w14:ligatures w14:val="none"/>
+        </w:rPr>
+      </w:pPr>
+      <w:r>
+        <w:rPr>
+          <w:rFonts w:ascii="Times New Roman" w:eastAsia="Times New Roman" w:hAnsi="Times New Roman" w:cs="Times New Roman"/>
+          <w:kern w:val="0"/>
+          <w:sz w:val="24"/>
+          <w:szCs w:val="24"/>
+          <w:lang w:eastAsia="pt-BR"/>
+          <w14:ligatures w14:val="none"/>
+        </w:rPr>
+        <w:t>ADMIN</w:t>
+      </w:r>
+    </w:p>
+    <w:p>
+      <w:pPr>
+        <w:spacing w:after="0" w:line="240" w:lineRule="auto"/>
+        <w:rPr>
+          <w:rFonts w:ascii="Times New Roman" w:eastAsia="Times New Roman" w:hAnsi="Times New Roman" w:cs="Times New Roman"/>
+          <w:kern w:val="0"/>
+          <w:sz w:val="24"/>
+          <w:szCs w:val="24"/>
+          <w:lang w:eastAsia="pt-BR"/>
+          <w14:ligatures w14:val="none"/>
+        </w:rPr>
+      </w:pPr>
+      <w:r>
+        <w:rPr>
+          <w:rFonts w:ascii="Times New Roman" w:eastAsia="Times New Roman" w:hAnsi="Times New Roman" w:cs="Times New Roman"/>
+          <w:kern w:val="0"/>
+          <w:sz w:val="24"/>
+          <w:szCs w:val="24"/>
+          <w:lang w:eastAsia="pt-BR"/>
+          <w14:ligatures w14:val="none"/>
+        </w:rPr>
+        <w:t>├─ Gerencia usuários</w:t>
+      </w:r>
+    </w:p>
+    <w:p>
+      <w:pPr>
+        <w:spacing w:after="0" w:line="240" w:lineRule="auto"/>
+        <w:rPr>
+          <w:rFonts w:ascii="Times New Roman" w:eastAsia="Times New Roman" w:hAnsi="Times New Roman" w:cs="Times New Roman"/>
+          <w:kern w:val="0"/>
+          <w:sz w:val="24"/>
+          <w:szCs w:val="24"/>
+          <w:lang w:eastAsia="pt-BR"/>
+          <w14:ligatures w14:val="none"/>
+        </w:rPr>
+      </w:pPr>
+      <w:r>
+        <w:rPr>
+          <w:rFonts w:ascii="Times New Roman" w:eastAsia="Times New Roman" w:hAnsi="Times New Roman" w:cs="Times New Roman"/>
+          <w:kern w:val="0"/>
+          <w:sz w:val="24"/>
+          <w:szCs w:val="24"/>
+          <w:lang w:eastAsia="pt-BR"/>
+          <w14:ligatures w14:val="none"/>
+        </w:rPr>
+        <w:t>├─ Gerencia produtos</w:t>
+      </w:r>
+    </w:p>
+    <w:p>
+      <w:pPr>
+        <w:spacing w:after="0" w:line="240" w:lineRule="auto"/>
+        <w:rPr>
+          <w:rFonts w:ascii="Times New Roman" w:eastAsia="Times New Roman" w:hAnsi="Times New Roman" w:cs="Times New Roman"/>
+          <w:kern w:val="0"/>
+          <w:sz w:val="24"/>
+          <w:szCs w:val="24"/>
+          <w:lang w:eastAsia="pt-BR"/>
+          <w14:ligatures w14:val="none"/>
+        </w:rPr>
+      </w:pPr>
+      <w:r>
+        <w:rPr>
+          <w:rFonts w:ascii="Times New Roman" w:eastAsia="Times New Roman" w:hAnsi="Times New Roman" w:cs="Times New Roman"/>
+          <w:kern w:val="0"/>
+          <w:sz w:val="24"/>
+          <w:szCs w:val="24"/>
+          <w:lang w:eastAsia="pt-BR"/>
+          <w14:ligatures w14:val="none"/>
+        </w:rPr>
+        <w:t>├─ Relatórios</w:t>
+      </w:r>
+    </w:p>
+    <w:p>
+      <w:pPr>
+        <w:spacing w:after="0" w:line="240" w:lineRule="auto"/>
+        <w:rPr>
+          <w:rFonts w:ascii="Times New Roman" w:eastAsia="Times New Roman" w:hAnsi="Times New Roman" w:cs="Times New Roman"/>
+          <w:kern w:val="0"/>
+          <w:sz w:val="24"/>
+          <w:szCs w:val="24"/>
+          <w:lang w:eastAsia="pt-BR"/>
+          <w14:ligatures w14:val="none"/>
+        </w:rPr>
+      </w:pPr>
+      <w:r>
+        <w:rPr>
+          <w:rFonts w:ascii="Times New Roman" w:eastAsia="Times New Roman" w:hAnsi="Times New Roman" w:cs="Times New Roman"/>
+          <w:kern w:val="0"/>
+          <w:sz w:val="24"/>
+          <w:szCs w:val="24"/>
+          <w:lang w:eastAsia="pt-BR"/>
+          <w14:ligatures w14:val="none"/>
+        </w:rPr>
+        <w:t>├─ Dashboard completo</w:t>
+      </w:r>
+    </w:p>
+    <w:p>
+      <w:pPr>
+        <w:spacing w:after="0" w:line="240" w:lineRule="auto"/>
+        <w:rPr>
+          <w:rFonts w:ascii="Times New Roman" w:eastAsia="Times New Roman" w:hAnsi="Times New Roman" w:cs="Times New Roman"/>
+          <w:kern w:val="0"/>
+          <w:sz w:val="24"/>
+          <w:szCs w:val="24"/>
+          <w:lang w:eastAsia="pt-BR"/>
+          <w14:ligatures w14:val="none"/>
+        </w:rPr>
+      </w:pPr>
+      <w:r>
+        <w:rPr>
+          <w:rFonts w:ascii="Times New Roman" w:eastAsia="Times New Roman" w:hAnsi="Times New Roman" w:cs="Times New Roman"/>
+          <w:kern w:val="0"/>
+          <w:sz w:val="24"/>
+          <w:szCs w:val="24"/>
+          <w:lang w:eastAsia="pt-BR"/>
+          <w14:ligatures w14:val="none"/>
+        </w:rPr>
+        <w:t>└─ Configurações</w:t>
+      </w:r>
+    </w:p>
+    <w:p>
+      <w:pPr>
+        <w:spacing w:after="0" w:line="240" w:lineRule="auto"/>
+        <w:rPr>
+          <w:rFonts w:ascii="Times New Roman" w:eastAsia="Times New Roman" w:hAnsi="Times New Roman" w:cs="Times New Roman"/>
+          <w:kern w:val="0"/>
+          <w:sz w:val="24"/>
+          <w:szCs w:val="24"/>
+          <w:lang w:eastAsia="pt-BR"/>
+          <w14:ligatures w14:val="none"/>
+        </w:rPr>
+      </w:pPr>
+    </w:p>
+    <w:p>
+      <w:pPr>
+        <w:spacing w:after="0" w:line="240" w:lineRule="auto"/>
+        <w:rPr>
+          <w:rFonts w:ascii="Times New Roman" w:eastAsia="Times New Roman" w:hAnsi="Times New Roman" w:cs="Times New Roman"/>
+          <w:kern w:val="0"/>
+          <w:sz w:val="24"/>
+          <w:szCs w:val="24"/>
+          <w:lang w:eastAsia="pt-BR"/>
+          <w14:ligatures w14:val="none"/>
+        </w:rPr>
+      </w:pPr>
+    </w:p>
+    <w:p>
+      <w:pPr>
+        <w:spacing w:after="0" w:line="240" w:lineRule="auto"/>
+        <w:rPr>
+          <w:rFonts w:ascii="Times New Roman" w:eastAsia="Times New Roman" w:hAnsi="Times New Roman" w:cs="Times New Roman"/>
+          <w:kern w:val="0"/>
+          <w:sz w:val="24"/>
+          <w:szCs w:val="24"/>
+          <w:lang w:eastAsia="pt-BR"/>
+          <w14:ligatures w14:val="none"/>
+        </w:rPr>
+      </w:pPr>
+      <w:r>
+        <w:rPr>
+          <w:rFonts w:ascii="Times New Roman" w:eastAsia="Times New Roman" w:hAnsi="Times New Roman" w:cs="Times New Roman"/>
+          <w:kern w:val="0"/>
+          <w:sz w:val="24"/>
+          <w:szCs w:val="24"/>
+          <w:lang w:eastAsia="pt-BR"/>
+          <w14:ligatures w14:val="none"/>
+        </w:rPr>
+        <w:t>ATTENDANT (Caixa)</w:t>
+      </w:r>
+    </w:p>
+    <w:p>
+      <w:pPr>
+        <w:spacing w:after="0" w:line="240" w:lineRule="auto"/>
+        <w:rPr>
+          <w:rFonts w:ascii="Times New Roman" w:eastAsia="Times New Roman" w:hAnsi="Times New Roman" w:cs="Times New Roman"/>
+          <w:kern w:val="0"/>
+          <w:sz w:val="24"/>
+          <w:szCs w:val="24"/>
+          <w:lang w:eastAsia="pt-BR"/>
+          <w14:ligatures w14:val="none"/>
+        </w:rPr>
+      </w:pPr>
+      <w:r>
+        <w:rPr>
+          <w:rFonts w:ascii="Times New Roman" w:eastAsia="Times New Roman" w:hAnsi="Times New Roman" w:cs="Times New Roman"/>
+          <w:kern w:val="0"/>
+          <w:sz w:val="24"/>
+          <w:szCs w:val="24"/>
+          <w:lang w:eastAsia="pt-BR"/>
+          <w14:ligatures w14:val="none"/>
+        </w:rPr>
+        <w:t>├─ Criar pedidos presenciais</w:t>
+      </w:r>
+    </w:p>
+    <w:p>
+      <w:pPr>
+        <w:spacing w:after="0" w:line="240" w:lineRule="auto"/>
+        <w:rPr>
+          <w:rFonts w:ascii="Times New Roman" w:eastAsia="Times New Roman" w:hAnsi="Times New Roman" w:cs="Times New Roman"/>
+          <w:kern w:val="0"/>
+          <w:sz w:val="24"/>
+          <w:szCs w:val="24"/>
+          <w:lang w:eastAsia="pt-BR"/>
+          <w14:ligatures w14:val="none"/>
+        </w:rPr>
+      </w:pPr>
+      <w:r>
+        <w:rPr>
+          <w:rFonts w:ascii="Times New Roman" w:eastAsia="Times New Roman" w:hAnsi="Times New Roman" w:cs="Times New Roman"/>
+          <w:kern w:val="0"/>
+          <w:sz w:val="24"/>
+          <w:szCs w:val="24"/>
+          <w:lang w:eastAsia="pt-BR"/>
+          <w14:ligatures w14:val="none"/>
+        </w:rPr>
+        <w:t>├─ Consultar pedidos</w:t>
+      </w:r>
+    </w:p>
+    <w:p>
+      <w:pPr>
+        <w:spacing w:after="0" w:line="240" w:lineRule="auto"/>
+        <w:rPr>
+          <w:rFonts w:ascii="Times New Roman" w:eastAsia="Times New Roman" w:hAnsi="Times New Roman" w:cs="Times New Roman"/>
+          <w:kern w:val="0"/>
+          <w:sz w:val="24"/>
+          <w:szCs w:val="24"/>
+          <w:lang w:eastAsia="pt-BR"/>
+          <w14:ligatures w14:val="none"/>
+        </w:rPr>
+      </w:pPr>
+      <w:r>
+        <w:rPr>
+          <w:rFonts w:ascii="Times New Roman" w:eastAsia="Times New Roman" w:hAnsi="Times New Roman" w:cs="Times New Roman"/>
+          <w:kern w:val="0"/>
+          <w:sz w:val="24"/>
+          <w:szCs w:val="24"/>
+          <w:lang w:eastAsia="pt-BR"/>
+          <w14:ligatures w14:val="none"/>
+        </w:rPr>
+        <w:t>├─ Receber pagamento</w:t>
+      </w:r>
+    </w:p>
+    <w:p>
+      <w:pPr>
+        <w:spacing w:after="0" w:line="240" w:lineRule="auto"/>
+        <w:rPr>
+          <w:rFonts w:ascii="Times New Roman" w:eastAsia="Times New Roman" w:hAnsi="Times New Roman" w:cs="Times New Roman"/>
+          <w:kern w:val="0"/>
+          <w:sz w:val="24"/>
+          <w:szCs w:val="24"/>
+          <w:lang w:eastAsia="pt-BR"/>
+          <w14:ligatures w14:val="none"/>
+        </w:rPr>
+      </w:pPr>
+      <w:r>
+        <w:rPr>
+          <w:rFonts w:ascii="Times New Roman" w:eastAsia="Times New Roman" w:hAnsi="Times New Roman" w:cs="Times New Roman"/>
+          <w:kern w:val="0"/>
+          <w:sz w:val="24"/>
+          <w:szCs w:val="24"/>
+          <w:lang w:eastAsia="pt-BR"/>
+          <w14:ligatures w14:val="none"/>
+        </w:rPr>
+        <w:t>├─ Cancelar pedido (se permitido)</w:t>
+      </w:r>
+    </w:p>
+    <w:p>
+      <w:pPr>
+        <w:spacing w:after="0" w:line="240" w:lineRule="auto"/>
+        <w:rPr>
+          <w:rFonts w:ascii="Times New Roman" w:eastAsia="Times New Roman" w:hAnsi="Times New Roman" w:cs="Times New Roman"/>
+          <w:kern w:val="0"/>
+          <w:sz w:val="24"/>
+          <w:szCs w:val="24"/>
+          <w:lang w:eastAsia="pt-BR"/>
+          <w14:ligatures w14:val="none"/>
+        </w:rPr>
+      </w:pPr>
+      <w:r>
+        <w:rPr>
+          <w:rFonts w:ascii="Times New Roman" w:eastAsia="Times New Roman" w:hAnsi="Times New Roman" w:cs="Times New Roman"/>
+          <w:kern w:val="0"/>
+          <w:sz w:val="24"/>
+          <w:szCs w:val="24"/>
+          <w:lang w:eastAsia="pt-BR"/>
+          <w14:ligatures w14:val="none"/>
+        </w:rPr>
+        <w:t>└─ Consultar histórico</w:t>
+      </w:r>
+    </w:p>
+    <w:p>
+      <w:pPr>
+        <w:spacing w:after="0" w:line="240" w:lineRule="auto"/>
+        <w:rPr>
+          <w:rFonts w:ascii="Times New Roman" w:eastAsia="Times New Roman" w:hAnsi="Times New Roman" w:cs="Times New Roman"/>
+          <w:kern w:val="0"/>
+          <w:sz w:val="24"/>
+          <w:szCs w:val="24"/>
+          <w:lang w:eastAsia="pt-BR"/>
+          <w14:ligatures w14:val="none"/>
+        </w:rPr>
+      </w:pPr>
+    </w:p>
+    <w:p>
+      <w:pPr>
+        <w:spacing w:after="0" w:line="240" w:lineRule="auto"/>
+        <w:rPr>
+          <w:rFonts w:ascii="Times New Roman" w:eastAsia="Times New Roman" w:hAnsi="Times New Roman" w:cs="Times New Roman"/>
+          <w:kern w:val="0"/>
+          <w:sz w:val="24"/>
+          <w:szCs w:val="24"/>
+          <w:lang w:eastAsia="pt-BR"/>
+          <w14:ligatures w14:val="none"/>
+        </w:rPr>
+      </w:pPr>
+    </w:p>
+    <w:p>
+      <w:pPr>
+        <w:spacing w:after="0" w:line="240" w:lineRule="auto"/>
+        <w:rPr>
+          <w:rFonts w:ascii="Times New Roman" w:eastAsia="Times New Roman" w:hAnsi="Times New Roman" w:cs="Times New Roman"/>
+          <w:kern w:val="0"/>
+          <w:sz w:val="24"/>
+          <w:szCs w:val="24"/>
+          <w:lang w:eastAsia="pt-BR"/>
+          <w14:ligatures w14:val="none"/>
+        </w:rPr>
+      </w:pPr>
+      <w:r>
+        <w:rPr>
+          <w:rFonts w:ascii="Times New Roman" w:eastAsia="Times New Roman" w:hAnsi="Times New Roman" w:cs="Times New Roman"/>
+          <w:kern w:val="0"/>
+          <w:sz w:val="24"/>
+          <w:szCs w:val="24"/>
+          <w:lang w:eastAsia="pt-BR"/>
+          <w14:ligatures w14:val="none"/>
+        </w:rPr>
+        <w:t>KITCHEN (Cozinha)</w:t>
+      </w:r>
+    </w:p>
+    <w:p>
+      <w:pPr>
+        <w:spacing w:after="0" w:line="240" w:lineRule="auto"/>
+        <w:rPr>
+          <w:rFonts w:ascii="Times New Roman" w:eastAsia="Times New Roman" w:hAnsi="Times New Roman" w:cs="Times New Roman"/>
+          <w:kern w:val="0"/>
+          <w:sz w:val="24"/>
+          <w:szCs w:val="24"/>
+          <w:lang w:eastAsia="pt-BR"/>
+          <w14:ligatures w14:val="none"/>
+        </w:rPr>
+      </w:pPr>
+      <w:r>
+        <w:rPr>
+          <w:rFonts w:ascii="Times New Roman" w:eastAsia="Times New Roman" w:hAnsi="Times New Roman" w:cs="Times New Roman"/>
+          <w:kern w:val="0"/>
+          <w:sz w:val="24"/>
+          <w:szCs w:val="24"/>
+          <w:lang w:eastAsia="pt-BR"/>
+          <w14:ligatures w14:val="none"/>
+        </w:rPr>
+        <w:t>├─ Ver fila de produção</w:t>
+      </w:r>
+    </w:p>
+    <w:p>
+      <w:pPr>
+        <w:spacing w:after="0" w:line="240" w:lineRule="auto"/>
+        <w:rPr>
+          <w:rFonts w:ascii="Times New Roman" w:eastAsia="Times New Roman" w:hAnsi="Times New Roman" w:cs="Times New Roman"/>
+          <w:kern w:val="0"/>
+          <w:sz w:val="24"/>
+          <w:szCs w:val="24"/>
+          <w:lang w:eastAsia="pt-BR"/>
+          <w14:ligatures w14:val="none"/>
+        </w:rPr>
+      </w:pPr>
+      <w:r>
+        <w:rPr>
+          <w:rFonts w:ascii="Times New Roman" w:eastAsia="Times New Roman" w:hAnsi="Times New Roman" w:cs="Times New Roman"/>
+          <w:kern w:val="0"/>
+          <w:sz w:val="24"/>
+          <w:szCs w:val="24"/>
+          <w:lang w:eastAsia="pt-BR"/>
+          <w14:ligatures w14:val="none"/>
+        </w:rPr>
+        <w:t>├─ Iniciar preparo</w:t>
+      </w:r>
+    </w:p>
+    <w:p>
+      <w:pPr>
+        <w:spacing w:after="0" w:line="240" w:lineRule="auto"/>
+        <w:rPr>
+          <w:rFonts w:ascii="Times New Roman" w:eastAsia="Times New Roman" w:hAnsi="Times New Roman" w:cs="Times New Roman"/>
+          <w:kern w:val="0"/>
+          <w:sz w:val="24"/>
+          <w:szCs w:val="24"/>
+          <w:lang w:eastAsia="pt-BR"/>
+          <w14:ligatures w14:val="none"/>
+        </w:rPr>
+      </w:pPr>
+      <w:r>
+        <w:rPr>
+          <w:rFonts w:ascii="Times New Roman" w:eastAsia="Times New Roman" w:hAnsi="Times New Roman" w:cs="Times New Roman"/>
+          <w:kern w:val="0"/>
+          <w:sz w:val="24"/>
+          <w:szCs w:val="24"/>
+          <w:lang w:eastAsia="pt-BR"/>
+          <w14:ligatures w14:val="none"/>
+        </w:rPr>
+        <w:t>├─ Finalizar preparo</w:t>
+      </w:r>
+    </w:p>
+    <w:p>
+      <w:pPr>
+        <w:spacing w:after="0" w:line="240" w:lineRule="auto"/>
+        <w:rPr>
+          <w:rFonts w:ascii="Times New Roman" w:eastAsia="Times New Roman" w:hAnsi="Times New Roman" w:cs="Times New Roman"/>
+          <w:kern w:val="0"/>
+          <w:sz w:val="24"/>
+          <w:szCs w:val="24"/>
+          <w:lang w:eastAsia="pt-BR"/>
+          <w14:ligatures w14:val="none"/>
+        </w:rPr>
+      </w:pPr>
+      <w:r>
+        <w:rPr>
+          <w:rFonts w:ascii="Times New Roman" w:eastAsia="Times New Roman" w:hAnsi="Times New Roman" w:cs="Times New Roman"/>
+          <w:kern w:val="0"/>
+          <w:sz w:val="24"/>
+          <w:szCs w:val="24"/>
+          <w:lang w:eastAsia="pt-BR"/>
+          <w14:ligatures w14:val="none"/>
+        </w:rPr>
+        <w:t>└─ Dashboard da cozinha</w:t>
+      </w:r>
+    </w:p>
+    <w:p>
+      <w:pPr>
+        <w:spacing w:after="0" w:line="240" w:lineRule="auto"/>
+        <w:rPr>
+          <w:rFonts w:ascii="Times New Roman" w:eastAsia="Times New Roman" w:hAnsi="Times New Roman" w:cs="Times New Roman"/>
+          <w:kern w:val="0"/>
+          <w:sz w:val="24"/>
+          <w:szCs w:val="24"/>
+          <w:lang w:eastAsia="pt-BR"/>
+          <w14:ligatures w14:val="none"/>
+        </w:rPr>
+      </w:pPr>
+    </w:p>
+    <w:p>
+      <w:pPr>
+        <w:spacing w:after="0" w:line="240" w:lineRule="auto"/>
+        <w:rPr>
+          <w:rFonts w:ascii="Times New Roman" w:eastAsia="Times New Roman" w:hAnsi="Times New Roman" w:cs="Times New Roman"/>
+          <w:kern w:val="0"/>
+          <w:sz w:val="24"/>
+          <w:szCs w:val="24"/>
+          <w:lang w:eastAsia="pt-BR"/>
+          <w14:ligatures w14:val="none"/>
+        </w:rPr>
+      </w:pPr>
+    </w:p>
+    <w:p>
+      <w:pPr>
+        <w:spacing w:after="0" w:line="240" w:lineRule="auto"/>
+        <w:rPr>
+          <w:rFonts w:ascii="Times New Roman" w:eastAsia="Times New Roman" w:hAnsi="Times New Roman" w:cs="Times New Roman"/>
+          <w:kern w:val="0"/>
+          <w:sz w:val="24"/>
+          <w:szCs w:val="24"/>
+          <w:lang w:eastAsia="pt-BR"/>
+          <w14:ligatures w14:val="none"/>
+        </w:rPr>
+      </w:pPr>
+      <w:r>
+        <w:rPr>
+          <w:rFonts w:ascii="Times New Roman" w:eastAsia="Times New Roman" w:hAnsi="Times New Roman" w:cs="Times New Roman"/>
+          <w:kern w:val="0"/>
+          <w:sz w:val="24"/>
+          <w:szCs w:val="24"/>
+          <w:lang w:eastAsia="pt-BR"/>
+          <w14:ligatures w14:val="none"/>
+        </w:rPr>
+        <w:t>CUSTOMER (Cliente)</w:t>
+      </w:r>
+    </w:p>
+    <w:p>
+      <w:pPr>
+        <w:spacing w:after="0" w:line="240" w:lineRule="auto"/>
+        <w:rPr>
+          <w:rFonts w:ascii="Times New Roman" w:eastAsia="Times New Roman" w:hAnsi="Times New Roman" w:cs="Times New Roman"/>
+          <w:kern w:val="0"/>
+          <w:sz w:val="24"/>
+          <w:szCs w:val="24"/>
+          <w:lang w:eastAsia="pt-BR"/>
+          <w14:ligatures w14:val="none"/>
+        </w:rPr>
+      </w:pPr>
+      <w:r>
+        <w:rPr>
+          <w:rFonts w:ascii="Times New Roman" w:eastAsia="Times New Roman" w:hAnsi="Times New Roman" w:cs="Times New Roman"/>
+          <w:kern w:val="0"/>
+          <w:sz w:val="24"/>
+          <w:szCs w:val="24"/>
+          <w:lang w:eastAsia="pt-BR"/>
+          <w14:ligatures w14:val="none"/>
+        </w:rPr>
+        <w:t>├─ Fazer pedidos</w:t>
+      </w:r>
+    </w:p>
+    <w:p>
+      <w:pPr>
+        <w:spacing w:after="0" w:line="240" w:lineRule="auto"/>
+        <w:rPr>
+          <w:rFonts w:ascii="Times New Roman" w:eastAsia="Times New Roman" w:hAnsi="Times New Roman" w:cs="Times New Roman"/>
+          <w:kern w:val="0"/>
+          <w:sz w:val="24"/>
+          <w:szCs w:val="24"/>
+          <w:lang w:eastAsia="pt-BR"/>
+          <w14:ligatures w14:val="none"/>
+        </w:rPr>
+      </w:pPr>
+      <w:r>
+        <w:rPr>
+          <w:rFonts w:ascii="Times New Roman" w:eastAsia="Times New Roman" w:hAnsi="Times New Roman" w:cs="Times New Roman"/>
+          <w:kern w:val="0"/>
+          <w:sz w:val="24"/>
+          <w:szCs w:val="24"/>
+          <w:lang w:eastAsia="pt-BR"/>
+          <w14:ligatures w14:val="none"/>
+        </w:rPr>
+        <w:t>├─ Consultar pedidos</w:t>
+      </w:r>
+    </w:p>
+    <w:p>
+      <w:pPr>
+        <w:spacing w:after="0" w:line="240" w:lineRule="auto"/>
+        <w:rPr>
+          <w:rFonts w:ascii="Times New Roman" w:eastAsia="Times New Roman" w:hAnsi="Times New Roman" w:cs="Times New Roman"/>
+          <w:kern w:val="0"/>
+          <w:sz w:val="24"/>
+          <w:szCs w:val="24"/>
+          <w:lang w:eastAsia="pt-BR"/>
+          <w14:ligatures w14:val="none"/>
+        </w:rPr>
+      </w:pPr>
+      <w:r>
+        <w:rPr>
+          <w:rFonts w:ascii="Times New Roman" w:eastAsia="Times New Roman" w:hAnsi="Times New Roman" w:cs="Times New Roman"/>
+          <w:kern w:val="0"/>
+          <w:sz w:val="24"/>
+          <w:szCs w:val="24"/>
+          <w:lang w:eastAsia="pt-BR"/>
+          <w14:ligatures w14:val="none"/>
+        </w:rPr>
+        <w:t>└─ Histórico próprio</w:t>
       </w:r>
     </w:p>
     <w:p/>
@@ -8513,7 +8882,7 @@
 </file>
 
 <file path=word/numbering.xml><?xml version="1.0" encoding="utf-8"?>
-<w:numbering xmlns:wpc="http://schemas.microsoft.com/office/word/2010/wordprocessingCanvas" xmlns:cx="http://schemas.microsoft.com/office/drawing/2014/chartex" xmlns:cx1="http://schemas.microsoft.com/office/drawing/2015/9/8/chartex" xmlns:cx2="http://schemas.microsoft.com/office/drawing/2015/10/21/chartex" xmlns:cx3="http://schemas.microsoft.com/office/drawing/2016/5/9/chartex" xmlns:cx4="http://schemas.microsoft.com/office/drawing/2016/5/10/chartex" xmlns:cx5="http://schemas.microsoft.com/office/drawing/2016/5/11/chartex" xmlns:cx6="http://schemas.microsoft.com/office/drawing/2016/5/12/chartex" xmlns:cx7="http://schemas.microsoft.com/office/drawing/2016/5/13/chartex" xmlns:cx8="http://schemas.microsoft.com/office/drawing/2016/5/14/chartex" xmlns:mc="http://schemas.openxmlformats.org/markup-compatibility/2006" xmlns:aink="http://schemas.microsoft.com/office/drawing/2016/ink" xmlns:am3d="http://schemas.microsoft.com/office/drawing/2017/model3d" xmlns:o="urn:schemas-microsoft-com:office:office" xmlns:oel="http://schemas.microsoft.com/office/2019/extlst" xmlns:r="http://schemas.openxmlformats.org/officeDocument/2006/relationships" xmlns:m="http://schemas.openxmlformats.org/officeDocument/2006/math" xmlns:v="urn:schemas-microsoft-com:vml" xmlns:wp14="http://schemas.microsoft.com/office/word/2010/wordprocessingDrawing" xmlns:wp="http://schemas.openxmlformats.org/drawingml/2006/wordprocessingDrawing" xmlns:w10="urn:schemas-microsoft-com:office:word" xmlns:w="http://schemas.openxmlformats.org/wordprocessingml/2006/main" xmlns:w14="http://schemas.microsoft.com/office/word/2010/wordml" xmlns:w15="http://schemas.microsoft.com/office/word/2012/wordml" xmlns:w16cex="http://schemas.microsoft.com/office/word/2018/wordml/cex" xmlns:w16cid="http://schemas.microsoft.com/office/word/2016/wordml/cid" xmlns:w16="http://schemas.microsoft.com/office/word/2018/wordml" xmlns:w16du="http://schemas.microsoft.com/office/word/2023/wordml/word16du" xmlns:w16sdtdh="http://schemas.microsoft.com/office/word/2020/wordml/sdtdatahash" xmlns:w16sdtfl="http://schemas.microsoft.com/office/word/2024/wordml/sdtformatlock" xmlns:w16se="http://schemas.microsoft.com/office/word/2015/wordml/symex" xmlns:wpg="http://schemas.microsoft.com/office/word/2010/wordprocessingGroup" xmlns:wpi="http://schemas.microsoft.com/office/word/2010/wordprocessingInk" xmlns:wne="http://schemas.microsoft.com/office/word/2006/wordml" xmlns:wps="http://schemas.microsoft.com/office/word/2010/wordprocessingShape" mc:Ignorable="w14 w15 w16se w16cid w16 w16cex w16sdtdh w16sdtfl w16du wp14">
+<w:numbering xmlns:wpc="http://schemas.microsoft.com/office/word/2010/wordprocessingCanvas" xmlns:cx="http://schemas.microsoft.com/office/drawing/2014/chartex" xmlns:cx1="http://schemas.microsoft.com/office/drawing/2015/9/8/chartex" xmlns:cx2="http://schemas.microsoft.com/office/drawing/2015/10/21/chartex" xmlns:cx3="http://schemas.microsoft.com/office/drawing/2016/5/9/chartex" xmlns:cx4="http://schemas.microsoft.com/office/drawing/2016/5/10/chartex" xmlns:cx5="http://schemas.microsoft.com/office/drawing/2016/5/11/chartex" xmlns:cx6="http://schemas.microsoft.com/office/drawing/2016/5/12/chartex" xmlns:cx7="http://schemas.microsoft.com/office/drawing/2016/5/13/chartex" xmlns:cx8="http://schemas.microsoft.com/office/drawing/2016/5/14/chartex" xmlns:mc="http://schemas.openxmlformats.org/markup-compatibility/2006" xmlns:aink="http://schemas.microsoft.com/office/drawing/2016/ink" xmlns:am3d="http://schemas.microsoft.com/office/drawing/2017/model3d" xmlns:o="urn:schemas-microsoft-com:office:office" xmlns:oel="http://schemas.microsoft.com/office/2019/extlst" xmlns:r="http://schemas.openxmlformats.org/officeDocument/2006/relationships" xmlns:m="http://schemas.openxmlformats.org/officeDocument/2006/math" xmlns:v="urn:schemas-microsoft-com:vml" xmlns:wp14="http://schemas.microsoft.com/office/word/2010/wordprocessingDrawing" xmlns:wp="http://schemas.openxmlformats.org/drawingml/2006/wordprocessingDrawing" xmlns:w10="urn:schemas-microsoft-com:office:word" xmlns:w="http://schemas.openxmlformats.org/wordprocessingml/2006/main" xmlns:w14="http://schemas.microsoft.com/office/word/2010/wordml" xmlns:w15="http://schemas.microsoft.com/office/word/2012/wordml" xmlns:w16cei="http://schemas.microsoft.com/office/word/2026/wordml/cei" xmlns:w16cex="http://schemas.microsoft.com/office/word/2018/wordml/cex" xmlns:w16cid="http://schemas.microsoft.com/office/word/2016/wordml/cid" xmlns:w16="http://schemas.microsoft.com/office/word/2018/wordml" xmlns:w16du="http://schemas.microsoft.com/office/word/2023/wordml/word16du" xmlns:w16sdtdh="http://schemas.microsoft.com/office/word/2020/wordml/sdtdatahash" xmlns:w16sdtfl="http://schemas.microsoft.com/office/word/2024/wordml/sdtformatlock" xmlns:w16se="http://schemas.microsoft.com/office/word/2015/wordml/symex" xmlns:wpg="http://schemas.microsoft.com/office/word/2010/wordprocessingGroup" xmlns:wpi="http://schemas.microsoft.com/office/word/2010/wordprocessingInk" xmlns:wne="http://schemas.microsoft.com/office/word/2006/wordml" xmlns:wps="http://schemas.microsoft.com/office/word/2010/wordprocessingShape" mc:Ignorable="w14 w15 w16se w16cid w16 w16cex w16sdtdh w16sdtfl w16du wp14">
   <w:abstractNum w:abstractNumId="0" w15:restartNumberingAfterBreak="0">
     <w:nsid w:val="02534E4D"/>
     <w:multiLevelType w:val="multilevel"/>
@@ -14178,6 +14547,7 @@
   <w:style w:type="character" w:default="1" w:styleId="Fontepargpadro">
     <w:name w:val="Default Paragraph Font"/>
     <w:uiPriority w:val="1"/>
+    <w:semiHidden/>
     <w:unhideWhenUsed/>
   </w:style>
   <w:style w:type="table" w:default="1" w:styleId="Tabelanormal">

</xml_diff>